<commit_message>
feat: add RMan report document for SRM-2526
</commit_message>
<xml_diff>
--- a/SRM/project/Report 1 - RMan.docx
+++ b/SRM/project/Report 1 - RMan.docx
@@ -9,35 +9,62 @@
         <w:rPr>
           <w:b w:val="1"/>
           <w:bCs w:val="1"/>
-          <w:sz w:val="30"/>
-          <w:szCs w:val="30"/>
-        </w:rPr>
-      </w:pPr>
-      <w:r>
+          <w:sz w:val="34"/>
+          <w:szCs w:val="34"/>
+        </w:rPr>
+      </w:pPr>
+      <w:r>
+        <w:rPr>
+          <w:b w:val="1"/>
+          <w:bCs w:val="1"/>
+          <w:sz w:val="34"/>
+          <w:szCs w:val="34"/>
+          <w:rtl w:val="0"/>
+        </w:rPr>
+        <w:t xml:space="preserve">Robotic Systems in Manipulation - Phase I: Kinematics</w:t>
+      </w:r>
+    </w:p>
+    <w:p>
+      <w:pPr>
+        <w:jc w:val="center"/>
         <w:rPr>
           <w:b w:val="1"/>
           <w:bCs w:val="1"/>
           <w:sz w:val="30"/>
           <w:szCs w:val="30"/>
-          <w:rtl w:val="0"/>
-        </w:rPr>
-        <w:t xml:space="preserve">Robotic Systems in Manipulation - Phase I: Kinematics</w:t>
-      </w:r>
-    </w:p>
-    <w:p>
-      <w:pPr>
-        <w:jc w:val="center"/>
+        </w:rPr>
+      </w:pPr>
+      <w:r>
+        <w:rPr>
+          <w:rtl w:val="0"/>
+        </w:rPr>
+      </w:r>
+    </w:p>
+    <w:p>
+      <w:pPr>
+        <w:jc w:val="left"/>
+        <w:rPr>
+          <w:sz w:val="24"/>
+          <w:szCs w:val="24"/>
+        </w:rPr>
+      </w:pPr>
+      <w:r>
         <w:rPr>
           <w:b w:val="1"/>
           <w:bCs w:val="1"/>
-          <w:sz w:val="30"/>
-          <w:szCs w:val="30"/>
-        </w:rPr>
-      </w:pPr>
-      <w:r>
-        <w:rPr>
-          <w:rtl w:val="0"/>
-        </w:rPr>
+          <w:sz w:val="24"/>
+          <w:szCs w:val="24"/>
+          <w:rtl w:val="0"/>
+        </w:rPr>
+        <w:t xml:space="preserve">Name:</w:t>
+      </w:r>
+      <w:r>
+        <w:rPr>
+          <w:sz w:val="24"/>
+          <w:szCs w:val="24"/>
+          <w:rtl w:val="0"/>
+        </w:rPr>
+        <w:t xml:space="preserve"> Rodrigo Sales Freire dos Santos        | ist1119658</w:t>
       </w:r>
     </w:p>
     <w:p>
@@ -64,7 +91,7 @@
           <w:szCs w:val="24"/>
           <w:rtl w:val="0"/>
         </w:rPr>
-        <w:t xml:space="preserve"> Rodrigo Sales Freire dos Santos        | ist1119658</w:t>
+        <w:t xml:space="preserve"> Mikhail Mohamed Shueb                    | ist1104014</w:t>
       </w:r>
     </w:p>
     <w:p>
@@ -76,85 +103,168 @@
         </w:rPr>
       </w:pPr>
       <w:r>
+        <w:rPr>
+          <w:rtl w:val="0"/>
+        </w:rPr>
+      </w:r>
+    </w:p>
+    <w:p>
+      <w:pPr>
+        <w:pStyle w:val="Heading2"/>
+        <w:rPr/>
+      </w:pPr>
+      <w:bookmarkStart w:colFirst="0" w:colLast="0" w:name="_lum6cw8p9pkh" w:id="0"/>
+      <w:bookmarkEnd w:id="0"/>
+      <w:r>
+        <w:rPr>
+          <w:rtl w:val="0"/>
+        </w:rPr>
+        <w:t xml:space="preserve">Step 1:</w:t>
+      </w:r>
+    </w:p>
+    <w:p>
+      <w:pPr>
+        <w:jc w:val="left"/>
         <w:rPr>
           <w:b w:val="1"/>
           <w:bCs w:val="1"/>
           <w:sz w:val="24"/>
           <w:szCs w:val="24"/>
-          <w:rtl w:val="0"/>
-        </w:rPr>
-        <w:t xml:space="preserve">Name:</w:t>
-      </w:r>
-      <w:r>
-        <w:rPr>
-          <w:sz w:val="24"/>
-          <w:szCs w:val="24"/>
-          <w:rtl w:val="0"/>
-        </w:rPr>
-        <w:t xml:space="preserve"> Mikhail Mohamed Shueb                    | ist1104014</w:t>
-      </w:r>
-    </w:p>
-    <w:p>
-      <w:pPr>
-        <w:jc w:val="left"/>
-        <w:rPr>
-          <w:sz w:val="24"/>
-          <w:szCs w:val="24"/>
-        </w:rPr>
-      </w:pPr>
-      <w:r>
-        <w:rPr>
-          <w:rtl w:val="0"/>
-        </w:rPr>
-      </w:r>
-    </w:p>
-    <w:p>
-      <w:pPr>
-        <w:jc w:val="left"/>
-        <w:rPr>
-          <w:sz w:val="24"/>
-          <w:szCs w:val="24"/>
-        </w:rPr>
-      </w:pPr>
-      <w:r>
-        <w:rPr>
-          <w:rtl w:val="0"/>
-        </w:rPr>
-      </w:r>
-    </w:p>
-    <w:p>
-      <w:pPr>
-        <w:jc w:val="left"/>
-        <w:rPr>
-          <w:sz w:val="24"/>
-          <w:szCs w:val="24"/>
-        </w:rPr>
-      </w:pPr>
-      <w:r>
-        <w:rPr>
-          <w:rtl w:val="0"/>
-        </w:rPr>
-      </w:r>
-    </w:p>
-    <w:p>
-      <w:pPr>
-        <w:jc w:val="left"/>
+        </w:rPr>
+      </w:pPr>
+      <w:r>
+        <w:rPr>
+          <w:rtl w:val="0"/>
+        </w:rPr>
+      </w:r>
+    </w:p>
+    <w:p>
+      <w:pPr>
+        <w:spacing w:after="240" w:lineRule="auto"/>
+        <w:rPr>
+          <w:sz w:val="24"/>
+          <w:szCs w:val="24"/>
+        </w:rPr>
+      </w:pPr>
+      <w:r>
+        <w:rPr>
+          <w:sz w:val="24"/>
+          <w:szCs w:val="24"/>
+          <w:rtl w:val="0"/>
+        </w:rPr>
+        <w:t xml:space="preserve">In this step, the kinematic model of the KUKA LBR MED robot was developed using the Denavit Hartenberg (D-H) convention.</w:t>
+      </w:r>
+    </w:p>
+    <w:p>
+      <w:pPr>
+        <w:spacing w:after="240" w:before="240" w:lineRule="auto"/>
+        <w:rPr>
+          <w:sz w:val="24"/>
+          <w:szCs w:val="24"/>
+        </w:rPr>
+      </w:pPr>
+      <w:r>
+        <w:rPr>
+          <w:sz w:val="24"/>
+          <w:szCs w:val="24"/>
+          <w:rtl w:val="0"/>
+        </w:rPr>
+        <w:t xml:space="preserve">The robot is a 7 degrees of freedom (DOF) serial redundant manipulator composed of revolute joints. The reference frames were assigned following the standard DH convention, where each Zi axis corresponds to the rotation axis of joint i + 1. The Xi axes were defined along the common normals between consecutive Z axes, while the origins were positioned at the intersection points between the joint axes and the common normals.</w:t>
+      </w:r>
+    </w:p>
+    <w:p>
+      <w:pPr>
+        <w:spacing w:after="240" w:before="240" w:lineRule="auto"/>
+        <w:rPr>
+          <w:sz w:val="24"/>
+          <w:szCs w:val="24"/>
+        </w:rPr>
+      </w:pPr>
+      <w:r>
+        <w:rPr>
+          <w:sz w:val="24"/>
+          <w:szCs w:val="24"/>
+          <w:rtl w:val="0"/>
+        </w:rPr>
+        <w:t xml:space="preserve">The resulting frame assignment is shown below, together with the orientation of all local coordinate systems and joint rotation directions.</w:t>
+      </w:r>
+    </w:p>
+    <w:p>
+      <w:pPr>
+        <w:jc w:val="center"/>
+        <w:rPr>
+          <w:sz w:val="24"/>
+          <w:szCs w:val="24"/>
+        </w:rPr>
+      </w:pPr>
+      <w:r>
         <w:rPr>
           <w:b w:val="1"/>
           <w:bCs w:val="1"/>
           <w:sz w:val="24"/>
           <w:szCs w:val="24"/>
         </w:rPr>
-      </w:pPr>
-      <w:r>
+        <w:drawing>
+          <wp:inline distB="114300" distT="114300" distL="114300" distR="114300">
+            <wp:extent cx="4045762" cy="5706654"/>
+            <wp:effectExtent b="0" l="0" r="0" t="0"/>
+            <wp:docPr id="14" name="image5.jpg"/>
+            <a:graphic>
+              <a:graphicData uri="http://schemas.openxmlformats.org/drawingml/2006/picture">
+                <pic:pic>
+                  <pic:nvPicPr>
+                    <pic:cNvPr id="0" name="image5.jpg"/>
+                    <pic:cNvPicPr preferRelativeResize="0"/>
+                  </pic:nvPicPr>
+                  <pic:blipFill>
+                    <a:blip r:embed="rId6"/>
+                    <a:srcRect b="0" l="0" r="0" t="0"/>
+                    <a:stretch>
+                      <a:fillRect/>
+                    </a:stretch>
+                  </pic:blipFill>
+                  <pic:spPr>
+                    <a:xfrm>
+                      <a:off x="0" y="0"/>
+                      <a:ext cx="4045762" cy="5706654"/>
+                    </a:xfrm>
+                    <a:prstGeom prst="rect"/>
+                    <a:ln/>
+                  </pic:spPr>
+                </pic:pic>
+              </a:graphicData>
+            </a:graphic>
+          </wp:inline>
+        </w:drawing>
+      </w:r>
+      <w:r>
+        <w:rPr>
+          <w:rtl w:val="0"/>
+        </w:rPr>
+      </w:r>
+    </w:p>
+    <w:p>
+      <w:pPr>
+        <w:spacing w:after="240" w:before="240" w:lineRule="auto"/>
         <w:rPr>
           <w:b w:val="1"/>
           <w:bCs w:val="1"/>
           <w:sz w:val="24"/>
           <w:szCs w:val="24"/>
-          <w:rtl w:val="0"/>
-        </w:rPr>
-        <w:t xml:space="preserve">Step 5:</w:t>
+        </w:rPr>
+      </w:pPr>
+      <w:r>
+        <w:rPr>
+          <w:sz w:val="24"/>
+          <w:szCs w:val="24"/>
+          <w:rtl w:val="0"/>
+        </w:rPr>
+        <w:t xml:space="preserve">The final Denavit–Hartenberg table obtained for the manipulator is presented below.</w:t>
+      </w:r>
+      <w:r>
+        <w:rPr>
+          <w:rtl w:val="0"/>
+        </w:rPr>
       </w:r>
     </w:p>
     <w:p>
@@ -171,6 +281,3373 @@
         <w:rPr>
           <w:rtl w:val="0"/>
         </w:rPr>
+      </w:r>
+    </w:p>
+    <w:p>
+      <w:pPr>
+        <w:jc w:val="center"/>
+        <w:rPr/>
+      </w:pPr>
+      <w:r>
+        <w:rPr>
+          <w:rtl w:val="0"/>
+        </w:rPr>
+      </w:r>
+    </w:p>
+    <w:tbl>
+      <w:tblPr>
+        <w:tblStyle w:val="Table1"/>
+        <w:tblW w:w="7200.0" w:type="dxa"/>
+        <w:jc w:val="left"/>
+        <w:tblBorders>
+          <w:top w:color="000000" w:space="0" w:sz="8" w:val="single"/>
+          <w:left w:color="000000" w:space="0" w:sz="8" w:val="single"/>
+          <w:bottom w:color="000000" w:space="0" w:sz="8" w:val="single"/>
+          <w:right w:color="000000" w:space="0" w:sz="8" w:val="single"/>
+          <w:insideH w:color="000000" w:space="0" w:sz="8" w:val="single"/>
+          <w:insideV w:color="000000" w:space="0" w:sz="8" w:val="single"/>
+        </w:tblBorders>
+        <w:tblLayout w:type="fixed"/>
+        <w:tblLook w:val="0600"/>
+      </w:tblPr>
+      <w:tblGrid>
+        <w:gridCol w:w="1200"/>
+        <w:gridCol w:w="1200"/>
+        <w:gridCol w:w="1200"/>
+        <w:gridCol w:w="1200"/>
+        <w:gridCol w:w="1200"/>
+        <w:gridCol w:w="1200"/>
+        <w:tblGridChange w:id="0">
+          <w:tblGrid>
+            <w:gridCol w:w="1200"/>
+            <w:gridCol w:w="1200"/>
+            <w:gridCol w:w="1200"/>
+            <w:gridCol w:w="1200"/>
+            <w:gridCol w:w="1200"/>
+            <w:gridCol w:w="1200"/>
+          </w:tblGrid>
+        </w:tblGridChange>
+      </w:tblGrid>
+      <w:tr>
+        <w:trPr>
+          <w:cantSplit w:val="0"/>
+          <w:tblHeader w:val="1"/>
+        </w:trPr>
+        <w:tc>
+          <w:tcPr/>
+          <w:p>
+            <w:pPr>
+              <w:jc w:val="center"/>
+              <w:rPr/>
+            </w:pPr>
+            <w:r>
+              <w:rPr>
+                <w:b w:val="1"/>
+                <w:bCs w:val="1"/>
+                <w:rtl w:val="0"/>
+              </w:rPr>
+              <w:t xml:space="preserve">Joint i</w:t>
+            </w:r>
+            <w:r>
+              <w:rPr>
+                <w:rtl w:val="0"/>
+              </w:rPr>
+            </w:r>
+          </w:p>
+        </w:tc>
+        <w:tc>
+          <w:tcPr/>
+          <w:p>
+            <w:pPr>
+              <w:jc w:val="center"/>
+              <w:rPr/>
+            </w:pPr>
+            <w:r>
+              <w:rPr>
+                <w:b w:val="1"/>
+                <w:bCs w:val="1"/>
+                <w:rtl w:val="0"/>
+              </w:rPr>
+              <w:t xml:space="preserve">d_i</w:t>
+            </w:r>
+            <w:r>
+              <w:rPr>
+                <w:rtl w:val="0"/>
+              </w:rPr>
+            </w:r>
+          </w:p>
+        </w:tc>
+        <w:tc>
+          <w:tcPr/>
+          <w:p>
+            <w:pPr>
+              <w:jc w:val="center"/>
+              <w:rPr/>
+            </w:pPr>
+            <w:r>
+              <w:rPr>
+                <w:b w:val="1"/>
+                <w:bCs w:val="1"/>
+                <w:rtl w:val="0"/>
+              </w:rPr>
+              <w:t xml:space="preserve">θ_i</w:t>
+            </w:r>
+            <w:r>
+              <w:rPr>
+                <w:rtl w:val="0"/>
+              </w:rPr>
+            </w:r>
+          </w:p>
+        </w:tc>
+        <w:tc>
+          <w:tcPr/>
+          <w:p>
+            <w:pPr>
+              <w:jc w:val="center"/>
+              <w:rPr/>
+            </w:pPr>
+            <w:r>
+              <w:rPr>
+                <w:b w:val="1"/>
+                <w:bCs w:val="1"/>
+                <w:rtl w:val="0"/>
+              </w:rPr>
+              <w:t xml:space="preserve">a_i</w:t>
+            </w:r>
+            <w:r>
+              <w:rPr>
+                <w:rtl w:val="0"/>
+              </w:rPr>
+            </w:r>
+          </w:p>
+        </w:tc>
+        <w:tc>
+          <w:tcPr/>
+          <w:p>
+            <w:pPr>
+              <w:jc w:val="center"/>
+              <w:rPr/>
+            </w:pPr>
+            <w:r>
+              <w:rPr>
+                <w:b w:val="1"/>
+                <w:bCs w:val="1"/>
+                <w:rtl w:val="0"/>
+              </w:rPr>
+              <w:t xml:space="preserve">α_i</w:t>
+            </w:r>
+            <w:r>
+              <w:rPr>
+                <w:rtl w:val="0"/>
+              </w:rPr>
+            </w:r>
+          </w:p>
+        </w:tc>
+        <w:tc>
+          <w:tcPr/>
+          <w:p>
+            <w:pPr>
+              <w:jc w:val="center"/>
+              <w:rPr/>
+            </w:pPr>
+            <w:r>
+              <w:rPr>
+                <w:b w:val="1"/>
+                <w:bCs w:val="1"/>
+                <w:rtl w:val="0"/>
+              </w:rPr>
+              <w:t xml:space="preserve">Offset</w:t>
+            </w:r>
+            <w:r>
+              <w:rPr>
+                <w:rtl w:val="0"/>
+              </w:rPr>
+            </w:r>
+          </w:p>
+        </w:tc>
+      </w:tr>
+      <w:tr>
+        <w:trPr>
+          <w:cantSplit w:val="0"/>
+          <w:tblHeader w:val="0"/>
+        </w:trPr>
+        <w:tc>
+          <w:tcPr/>
+          <w:p>
+            <w:pPr>
+              <w:jc w:val="center"/>
+              <w:rPr/>
+            </w:pPr>
+            <w:r>
+              <w:rPr>
+                <w:rtl w:val="0"/>
+              </w:rPr>
+              <w:t xml:space="preserve">1</w:t>
+            </w:r>
+          </w:p>
+        </w:tc>
+        <w:tc>
+          <w:tcPr/>
+          <w:p>
+            <w:pPr>
+              <w:jc w:val="center"/>
+              <w:rPr/>
+            </w:pPr>
+            <w:r>
+              <w:rPr>
+                <w:rtl w:val="0"/>
+              </w:rPr>
+              <w:t xml:space="preserve">0</w:t>
+            </w:r>
+          </w:p>
+        </w:tc>
+        <w:tc>
+          <w:tcPr/>
+          <w:p>
+            <w:pPr>
+              <w:jc w:val="center"/>
+              <w:rPr/>
+            </w:pPr>
+            <w:r>
+              <w:rPr>
+                <w:rtl w:val="0"/>
+              </w:rPr>
+              <w:t xml:space="preserve">θ_1</w:t>
+            </w:r>
+          </w:p>
+        </w:tc>
+        <w:tc>
+          <w:tcPr/>
+          <w:p>
+            <w:pPr>
+              <w:jc w:val="center"/>
+              <w:rPr/>
+            </w:pPr>
+            <w:r>
+              <w:rPr>
+                <w:rtl w:val="0"/>
+              </w:rPr>
+              <w:t xml:space="preserve">0</w:t>
+            </w:r>
+          </w:p>
+        </w:tc>
+        <w:tc>
+          <w:tcPr/>
+          <w:p>
+            <w:pPr>
+              <w:jc w:val="center"/>
+              <w:rPr/>
+            </w:pPr>
+            <w:r>
+              <w:rPr>
+                <w:rtl w:val="0"/>
+              </w:rPr>
+              <w:t xml:space="preserve">π/2</w:t>
+            </w:r>
+          </w:p>
+        </w:tc>
+        <w:tc>
+          <w:tcPr/>
+          <w:p>
+            <w:pPr>
+              <w:jc w:val="center"/>
+              <w:rPr/>
+            </w:pPr>
+            <w:r>
+              <w:rPr>
+                <w:rtl w:val="0"/>
+              </w:rPr>
+              <w:t xml:space="preserve">0</w:t>
+            </w:r>
+          </w:p>
+        </w:tc>
+      </w:tr>
+      <w:tr>
+        <w:trPr>
+          <w:cantSplit w:val="0"/>
+          <w:tblHeader w:val="0"/>
+        </w:trPr>
+        <w:tc>
+          <w:tcPr/>
+          <w:p>
+            <w:pPr>
+              <w:jc w:val="center"/>
+              <w:rPr/>
+            </w:pPr>
+            <w:r>
+              <w:rPr>
+                <w:rtl w:val="0"/>
+              </w:rPr>
+              <w:t xml:space="preserve">2</w:t>
+            </w:r>
+          </w:p>
+        </w:tc>
+        <w:tc>
+          <w:tcPr/>
+          <w:p>
+            <w:pPr>
+              <w:jc w:val="center"/>
+              <w:rPr/>
+            </w:pPr>
+            <w:r>
+              <w:rPr>
+                <w:rtl w:val="0"/>
+              </w:rPr>
+              <w:t xml:space="preserve">0</w:t>
+            </w:r>
+          </w:p>
+        </w:tc>
+        <w:tc>
+          <w:tcPr/>
+          <w:p>
+            <w:pPr>
+              <w:jc w:val="center"/>
+              <w:rPr/>
+            </w:pPr>
+            <w:r>
+              <w:rPr>
+                <w:rtl w:val="0"/>
+              </w:rPr>
+              <w:t xml:space="preserve">θ_2</w:t>
+            </w:r>
+          </w:p>
+        </w:tc>
+        <w:tc>
+          <w:tcPr/>
+          <w:p>
+            <w:pPr>
+              <w:jc w:val="center"/>
+              <w:rPr/>
+            </w:pPr>
+            <w:r>
+              <w:rPr>
+                <w:rtl w:val="0"/>
+              </w:rPr>
+              <w:t xml:space="preserve">0</w:t>
+            </w:r>
+          </w:p>
+        </w:tc>
+        <w:tc>
+          <w:tcPr/>
+          <w:p>
+            <w:pPr>
+              <w:jc w:val="center"/>
+              <w:rPr/>
+            </w:pPr>
+            <w:r>
+              <w:rPr>
+                <w:rtl w:val="0"/>
+              </w:rPr>
+              <w:t xml:space="preserve">-π/2</w:t>
+            </w:r>
+          </w:p>
+        </w:tc>
+        <w:tc>
+          <w:tcPr/>
+          <w:p>
+            <w:pPr>
+              <w:jc w:val="center"/>
+              <w:rPr/>
+            </w:pPr>
+            <w:r>
+              <w:rPr>
+                <w:rtl w:val="0"/>
+              </w:rPr>
+              <w:t xml:space="preserve">0</w:t>
+            </w:r>
+          </w:p>
+        </w:tc>
+      </w:tr>
+      <w:tr>
+        <w:trPr>
+          <w:cantSplit w:val="0"/>
+          <w:tblHeader w:val="0"/>
+        </w:trPr>
+        <w:tc>
+          <w:tcPr/>
+          <w:p>
+            <w:pPr>
+              <w:jc w:val="center"/>
+              <w:rPr/>
+            </w:pPr>
+            <w:r>
+              <w:rPr>
+                <w:rtl w:val="0"/>
+              </w:rPr>
+              <w:t xml:space="preserve">3</w:t>
+            </w:r>
+          </w:p>
+        </w:tc>
+        <w:tc>
+          <w:tcPr/>
+          <w:p>
+            <w:pPr>
+              <w:jc w:val="center"/>
+              <w:rPr/>
+            </w:pPr>
+            <w:r>
+              <w:rPr>
+                <w:rtl w:val="0"/>
+              </w:rPr>
+              <w:t xml:space="preserve">d_3</w:t>
+            </w:r>
+          </w:p>
+        </w:tc>
+        <w:tc>
+          <w:tcPr/>
+          <w:p>
+            <w:pPr>
+              <w:jc w:val="center"/>
+              <w:rPr/>
+            </w:pPr>
+            <w:r>
+              <w:rPr>
+                <w:rtl w:val="0"/>
+              </w:rPr>
+              <w:t xml:space="preserve">θ_3</w:t>
+            </w:r>
+          </w:p>
+        </w:tc>
+        <w:tc>
+          <w:tcPr/>
+          <w:p>
+            <w:pPr>
+              <w:jc w:val="center"/>
+              <w:rPr/>
+            </w:pPr>
+            <w:r>
+              <w:rPr>
+                <w:rtl w:val="0"/>
+              </w:rPr>
+              <w:t xml:space="preserve">0</w:t>
+            </w:r>
+          </w:p>
+        </w:tc>
+        <w:tc>
+          <w:tcPr/>
+          <w:p>
+            <w:pPr>
+              <w:jc w:val="center"/>
+              <w:rPr/>
+            </w:pPr>
+            <w:r>
+              <w:rPr>
+                <w:rtl w:val="0"/>
+              </w:rPr>
+              <w:t xml:space="preserve">-π/2</w:t>
+            </w:r>
+          </w:p>
+        </w:tc>
+        <w:tc>
+          <w:tcPr/>
+          <w:p>
+            <w:pPr>
+              <w:jc w:val="center"/>
+              <w:rPr/>
+            </w:pPr>
+            <w:r>
+              <w:rPr>
+                <w:rtl w:val="0"/>
+              </w:rPr>
+              <w:t xml:space="preserve">0</w:t>
+            </w:r>
+          </w:p>
+        </w:tc>
+      </w:tr>
+      <w:tr>
+        <w:trPr>
+          <w:cantSplit w:val="0"/>
+          <w:tblHeader w:val="0"/>
+        </w:trPr>
+        <w:tc>
+          <w:tcPr/>
+          <w:p>
+            <w:pPr>
+              <w:jc w:val="center"/>
+              <w:rPr/>
+            </w:pPr>
+            <w:r>
+              <w:rPr>
+                <w:rtl w:val="0"/>
+              </w:rPr>
+              <w:t xml:space="preserve">4</w:t>
+            </w:r>
+          </w:p>
+        </w:tc>
+        <w:tc>
+          <w:tcPr/>
+          <w:p>
+            <w:pPr>
+              <w:jc w:val="center"/>
+              <w:rPr/>
+            </w:pPr>
+            <w:r>
+              <w:rPr>
+                <w:rtl w:val="0"/>
+              </w:rPr>
+              <w:t xml:space="preserve">0</w:t>
+            </w:r>
+          </w:p>
+        </w:tc>
+        <w:tc>
+          <w:tcPr/>
+          <w:p>
+            <w:pPr>
+              <w:jc w:val="center"/>
+              <w:rPr/>
+            </w:pPr>
+            <w:r>
+              <w:rPr>
+                <w:rtl w:val="0"/>
+              </w:rPr>
+              <w:t xml:space="preserve">θ_4</w:t>
+            </w:r>
+          </w:p>
+        </w:tc>
+        <w:tc>
+          <w:tcPr/>
+          <w:p>
+            <w:pPr>
+              <w:jc w:val="center"/>
+              <w:rPr/>
+            </w:pPr>
+            <w:r>
+              <w:rPr>
+                <w:rtl w:val="0"/>
+              </w:rPr>
+              <w:t xml:space="preserve">0</w:t>
+            </w:r>
+          </w:p>
+        </w:tc>
+        <w:tc>
+          <w:tcPr/>
+          <w:p>
+            <w:pPr>
+              <w:jc w:val="center"/>
+              <w:rPr/>
+            </w:pPr>
+            <w:r>
+              <w:rPr>
+                <w:rtl w:val="0"/>
+              </w:rPr>
+              <w:t xml:space="preserve">π/2</w:t>
+            </w:r>
+          </w:p>
+        </w:tc>
+        <w:tc>
+          <w:tcPr/>
+          <w:p>
+            <w:pPr>
+              <w:jc w:val="center"/>
+              <w:rPr/>
+            </w:pPr>
+            <w:r>
+              <w:rPr>
+                <w:rtl w:val="0"/>
+              </w:rPr>
+              <w:t xml:space="preserve">0</w:t>
+            </w:r>
+          </w:p>
+        </w:tc>
+      </w:tr>
+      <w:tr>
+        <w:trPr>
+          <w:cantSplit w:val="0"/>
+          <w:tblHeader w:val="0"/>
+        </w:trPr>
+        <w:tc>
+          <w:tcPr/>
+          <w:p>
+            <w:pPr>
+              <w:jc w:val="center"/>
+              <w:rPr/>
+            </w:pPr>
+            <w:r>
+              <w:rPr>
+                <w:rtl w:val="0"/>
+              </w:rPr>
+              <w:t xml:space="preserve">5</w:t>
+            </w:r>
+          </w:p>
+        </w:tc>
+        <w:tc>
+          <w:tcPr/>
+          <w:p>
+            <w:pPr>
+              <w:jc w:val="center"/>
+              <w:rPr/>
+            </w:pPr>
+            <w:r>
+              <w:rPr>
+                <w:rtl w:val="0"/>
+              </w:rPr>
+              <w:t xml:space="preserve">d_5</w:t>
+            </w:r>
+            <w:r>
+              <w:rPr>
+                <w:rtl w:val="0"/>
+              </w:rPr>
+            </w:r>
+          </w:p>
+        </w:tc>
+        <w:tc>
+          <w:tcPr/>
+          <w:p>
+            <w:pPr>
+              <w:jc w:val="center"/>
+              <w:rPr/>
+            </w:pPr>
+            <w:r>
+              <w:rPr>
+                <w:rtl w:val="0"/>
+              </w:rPr>
+              <w:t xml:space="preserve">θ_5</w:t>
+            </w:r>
+          </w:p>
+        </w:tc>
+        <w:tc>
+          <w:tcPr/>
+          <w:p>
+            <w:pPr>
+              <w:jc w:val="center"/>
+              <w:rPr/>
+            </w:pPr>
+            <w:r>
+              <w:rPr>
+                <w:rtl w:val="0"/>
+              </w:rPr>
+              <w:t xml:space="preserve">0</w:t>
+            </w:r>
+          </w:p>
+        </w:tc>
+        <w:tc>
+          <w:tcPr/>
+          <w:p>
+            <w:pPr>
+              <w:jc w:val="center"/>
+              <w:rPr/>
+            </w:pPr>
+            <w:r>
+              <w:rPr>
+                <w:rtl w:val="0"/>
+              </w:rPr>
+              <w:t xml:space="preserve">π/2</w:t>
+            </w:r>
+          </w:p>
+        </w:tc>
+        <w:tc>
+          <w:tcPr/>
+          <w:p>
+            <w:pPr>
+              <w:jc w:val="center"/>
+              <w:rPr/>
+            </w:pPr>
+            <w:r>
+              <w:rPr>
+                <w:rtl w:val="0"/>
+              </w:rPr>
+              <w:t xml:space="preserve">0</w:t>
+            </w:r>
+          </w:p>
+        </w:tc>
+      </w:tr>
+      <w:tr>
+        <w:trPr>
+          <w:cantSplit w:val="0"/>
+          <w:tblHeader w:val="0"/>
+        </w:trPr>
+        <w:tc>
+          <w:tcPr/>
+          <w:p>
+            <w:pPr>
+              <w:jc w:val="center"/>
+              <w:rPr/>
+            </w:pPr>
+            <w:r>
+              <w:rPr>
+                <w:rtl w:val="0"/>
+              </w:rPr>
+              <w:t xml:space="preserve">6</w:t>
+            </w:r>
+          </w:p>
+        </w:tc>
+        <w:tc>
+          <w:tcPr/>
+          <w:p>
+            <w:pPr>
+              <w:jc w:val="center"/>
+              <w:rPr/>
+            </w:pPr>
+            <w:r>
+              <w:rPr>
+                <w:rtl w:val="0"/>
+              </w:rPr>
+              <w:t xml:space="preserve">0</w:t>
+            </w:r>
+          </w:p>
+        </w:tc>
+        <w:tc>
+          <w:tcPr/>
+          <w:p>
+            <w:pPr>
+              <w:jc w:val="center"/>
+              <w:rPr/>
+            </w:pPr>
+            <w:r>
+              <w:rPr>
+                <w:rtl w:val="0"/>
+              </w:rPr>
+              <w:t xml:space="preserve">θ_6</w:t>
+            </w:r>
+          </w:p>
+        </w:tc>
+        <w:tc>
+          <w:tcPr/>
+          <w:p>
+            <w:pPr>
+              <w:jc w:val="center"/>
+              <w:rPr/>
+            </w:pPr>
+            <w:r>
+              <w:rPr>
+                <w:rtl w:val="0"/>
+              </w:rPr>
+              <w:t xml:space="preserve">0</w:t>
+            </w:r>
+          </w:p>
+        </w:tc>
+        <w:tc>
+          <w:tcPr/>
+          <w:p>
+            <w:pPr>
+              <w:jc w:val="center"/>
+              <w:rPr/>
+            </w:pPr>
+            <w:r>
+              <w:rPr>
+                <w:rtl w:val="0"/>
+              </w:rPr>
+              <w:t xml:space="preserve">-π/2</w:t>
+            </w:r>
+          </w:p>
+        </w:tc>
+        <w:tc>
+          <w:tcPr/>
+          <w:p>
+            <w:pPr>
+              <w:jc w:val="center"/>
+              <w:rPr/>
+            </w:pPr>
+            <w:r>
+              <w:rPr>
+                <w:rtl w:val="0"/>
+              </w:rPr>
+              <w:t xml:space="preserve">0</w:t>
+            </w:r>
+          </w:p>
+        </w:tc>
+      </w:tr>
+      <w:tr>
+        <w:trPr>
+          <w:cantSplit w:val="0"/>
+          <w:tblHeader w:val="0"/>
+        </w:trPr>
+        <w:tc>
+          <w:tcPr/>
+          <w:p>
+            <w:pPr>
+              <w:jc w:val="center"/>
+              <w:rPr/>
+            </w:pPr>
+            <w:r>
+              <w:rPr>
+                <w:rtl w:val="0"/>
+              </w:rPr>
+              <w:t xml:space="preserve">7</w:t>
+            </w:r>
+          </w:p>
+        </w:tc>
+        <w:tc>
+          <w:tcPr/>
+          <w:p>
+            <w:pPr>
+              <w:jc w:val="center"/>
+              <w:rPr/>
+            </w:pPr>
+            <w:r>
+              <w:rPr>
+                <w:rtl w:val="0"/>
+              </w:rPr>
+              <w:t xml:space="preserve">d_7</w:t>
+            </w:r>
+            <w:r>
+              <w:rPr>
+                <w:rtl w:val="0"/>
+              </w:rPr>
+            </w:r>
+          </w:p>
+        </w:tc>
+        <w:tc>
+          <w:tcPr/>
+          <w:p>
+            <w:pPr>
+              <w:jc w:val="center"/>
+              <w:rPr/>
+            </w:pPr>
+            <w:r>
+              <w:rPr>
+                <w:rtl w:val="0"/>
+              </w:rPr>
+              <w:t xml:space="preserve">θ_7</w:t>
+            </w:r>
+          </w:p>
+        </w:tc>
+        <w:tc>
+          <w:tcPr/>
+          <w:p>
+            <w:pPr>
+              <w:jc w:val="center"/>
+              <w:rPr/>
+            </w:pPr>
+            <w:r>
+              <w:rPr>
+                <w:rtl w:val="0"/>
+              </w:rPr>
+              <w:t xml:space="preserve">0</w:t>
+            </w:r>
+          </w:p>
+        </w:tc>
+        <w:tc>
+          <w:tcPr/>
+          <w:p>
+            <w:pPr>
+              <w:jc w:val="center"/>
+              <w:rPr/>
+            </w:pPr>
+            <w:r>
+              <w:rPr>
+                <w:rtl w:val="0"/>
+              </w:rPr>
+              <w:t xml:space="preserve">0</w:t>
+            </w:r>
+          </w:p>
+        </w:tc>
+        <w:tc>
+          <w:tcPr/>
+          <w:p>
+            <w:pPr>
+              <w:jc w:val="center"/>
+              <w:rPr/>
+            </w:pPr>
+            <w:r>
+              <w:rPr>
+                <w:rtl w:val="0"/>
+              </w:rPr>
+              <w:t xml:space="preserve">0</w:t>
+            </w:r>
+          </w:p>
+        </w:tc>
+      </w:tr>
+    </w:tbl>
+    <w:p>
+      <w:pPr>
+        <w:jc w:val="center"/>
+        <w:rPr>
+          <w:b w:val="1"/>
+          <w:bCs w:val="1"/>
+          <w:sz w:val="24"/>
+          <w:szCs w:val="24"/>
+        </w:rPr>
+      </w:pPr>
+      <w:r>
+        <w:rPr>
+          <w:rtl w:val="0"/>
+        </w:rPr>
+      </w:r>
+    </w:p>
+    <w:p>
+      <w:pPr>
+        <w:rPr>
+          <w:sz w:val="24"/>
+          <w:szCs w:val="24"/>
+        </w:rPr>
+      </w:pPr>
+      <w:r>
+        <w:rPr>
+          <w:sz w:val="24"/>
+          <w:szCs w:val="24"/>
+          <w:rtl w:val="0"/>
+        </w:rPr>
+        <w:t xml:space="preserve">There are two versions of the KUKA LBR MED, so as advised in the lab classes we choose the model KUKA LBR </w:t>
+      </w:r>
+      <w:r>
+        <w:rPr>
+          <w:sz w:val="24"/>
+          <w:szCs w:val="24"/>
+          <w:rtl w:val="0"/>
+        </w:rPr>
+        <w:t xml:space="preserve">iiwa</w:t>
+      </w:r>
+      <w:r>
+        <w:rPr>
+          <w:sz w:val="24"/>
+          <w:szCs w:val="24"/>
+          <w:rtl w:val="0"/>
+        </w:rPr>
+        <w:t xml:space="preserve"> 7 R800 to determine the d values. Based on that, the respective values of d used in our project were d3 = 0.400 mm, d5 = 0.400 mm, d7 = 0.126 mm.</w:t>
+      </w:r>
+    </w:p>
+    <w:p>
+      <w:pPr>
+        <w:rPr>
+          <w:b w:val="1"/>
+          <w:bCs w:val="1"/>
+          <w:sz w:val="24"/>
+          <w:szCs w:val="24"/>
+        </w:rPr>
+      </w:pPr>
+      <w:r>
+        <w:rPr>
+          <w:rtl w:val="0"/>
+        </w:rPr>
+      </w:r>
+    </w:p>
+    <w:p>
+      <w:pPr>
+        <w:jc w:val="left"/>
+        <w:rPr>
+          <w:sz w:val="24"/>
+          <w:szCs w:val="24"/>
+        </w:rPr>
+      </w:pPr>
+      <w:r>
+        <w:rPr>
+          <w:rtl w:val="0"/>
+        </w:rPr>
+      </w:r>
+    </w:p>
+    <w:p>
+      <w:pPr>
+        <w:pStyle w:val="Heading2"/>
+        <w:rPr/>
+      </w:pPr>
+      <w:bookmarkStart w:colFirst="0" w:colLast="0" w:name="_zfkkytr6rxk" w:id="1"/>
+      <w:bookmarkEnd w:id="1"/>
+      <w:r>
+        <w:rPr>
+          <w:rtl w:val="0"/>
+        </w:rPr>
+        <w:t xml:space="preserve">Step 2:</w:t>
+      </w:r>
+    </w:p>
+    <w:p>
+      <w:pPr>
+        <w:rPr>
+          <w:b w:val="1"/>
+          <w:bCs w:val="1"/>
+          <w:sz w:val="28"/>
+          <w:szCs w:val="28"/>
+        </w:rPr>
+      </w:pPr>
+      <w:r>
+        <w:rPr>
+          <w:rtl w:val="0"/>
+        </w:rPr>
+      </w:r>
+    </w:p>
+    <w:p>
+      <w:pPr>
+        <w:pStyle w:val="Subtitle"/>
+        <w:ind w:left="0" w:firstLine="0"/>
+        <w:rPr>
+          <w:u w:val="single"/>
+        </w:rPr>
+      </w:pPr>
+      <w:bookmarkStart w:colFirst="0" w:colLast="0" w:name="_wb7n4ocwphgp" w:id="2"/>
+      <w:bookmarkEnd w:id="2"/>
+      <w:r>
+        <w:rPr>
+          <w:u w:val="single"/>
+          <w:rtl w:val="0"/>
+        </w:rPr>
+        <w:t xml:space="preserve">Direct Kinematics</w:t>
+      </w:r>
+    </w:p>
+    <w:p>
+      <w:pPr>
+        <w:rPr/>
+      </w:pPr>
+      <w:r>
+        <w:rPr>
+          <w:rtl w:val="0"/>
+        </w:rPr>
+      </w:r>
+    </w:p>
+    <w:p>
+      <w:pPr>
+        <w:rPr>
+          <w:sz w:val="24"/>
+          <w:szCs w:val="24"/>
+        </w:rPr>
+      </w:pPr>
+      <w:r>
+        <w:rPr>
+          <w:sz w:val="24"/>
+          <w:szCs w:val="24"/>
+          <w:rtl w:val="0"/>
+        </w:rPr>
+        <w:t xml:space="preserve">In this step, we developed the Direct Kinematics (DK) model using the Denavit-Hartenberg (D-H) parameters obtained in Step 1.</w:t>
+      </w:r>
+    </w:p>
+    <w:p>
+      <w:pPr>
+        <w:rPr>
+          <w:sz w:val="24"/>
+          <w:szCs w:val="24"/>
+        </w:rPr>
+      </w:pPr>
+      <w:r>
+        <w:rPr>
+          <w:sz w:val="24"/>
+          <w:szCs w:val="24"/>
+          <w:rtl w:val="0"/>
+        </w:rPr>
+        <w:t xml:space="preserve">The forward Transformation Matrix </w:t>
+      </w:r>
+      <m:oMath>
+        <m:r>
+          <w:rPr>
+            <w:sz w:val="24"/>
+            <w:szCs w:val="24"/>
+          </w:rPr>
+          <m:t xml:space="preserve">T</m:t>
+        </m:r>
+      </m:oMath>
+      <w:r>
+        <w:rPr>
+          <w:sz w:val="24"/>
+          <w:szCs w:val="24"/>
+          <w:vertAlign w:val="superscript"/>
+          <w:rtl w:val="0"/>
+        </w:rPr>
+        <w:t xml:space="preserve">7</w:t>
+      </w:r>
+      <w:r>
+        <w:rPr>
+          <w:sz w:val="24"/>
+          <w:szCs w:val="24"/>
+          <w:vertAlign w:val="subscript"/>
+          <w:rtl w:val="0"/>
+        </w:rPr>
+        <w:t xml:space="preserve">0 </w:t>
+      </w:r>
+      <w:r>
+        <w:rPr>
+          <w:sz w:val="24"/>
+          <w:szCs w:val="24"/>
+          <w:rtl w:val="0"/>
+        </w:rPr>
+        <w:t xml:space="preserve"> was computed symbolically by multiplying the individual transformation matrices </w:t>
+      </w:r>
+      <m:oMath>
+        <m:r>
+          <w:rPr>
+            <w:sz w:val="24"/>
+            <w:szCs w:val="24"/>
+          </w:rPr>
+          <m:t xml:space="preserve">A</m:t>
+        </m:r>
+      </m:oMath>
+      <w:r>
+        <w:rPr>
+          <w:sz w:val="24"/>
+          <w:szCs w:val="24"/>
+          <w:vertAlign w:val="superscript"/>
+          <w:rtl w:val="0"/>
+        </w:rPr>
+        <w:t xml:space="preserve">i+1</w:t>
+      </w:r>
+      <w:r>
+        <w:rPr>
+          <w:sz w:val="24"/>
+          <w:szCs w:val="24"/>
+          <w:vertAlign w:val="subscript"/>
+          <w:rtl w:val="0"/>
+        </w:rPr>
+        <w:t xml:space="preserve">i   </w:t>
+      </w:r>
+      <w:r>
+        <w:rPr>
+          <w:sz w:val="24"/>
+          <w:szCs w:val="24"/>
+          <w:rtl w:val="0"/>
+        </w:rPr>
+        <w:t xml:space="preserve">. Because the base reference frame (Frame 0) and the first joint frame (Frame 1) share the same origin in our convention, the parameter d</w:t>
+      </w:r>
+      <w:r>
+        <w:rPr>
+          <w:sz w:val="24"/>
+          <w:szCs w:val="24"/>
+          <w:vertAlign w:val="subscript"/>
+          <w:rtl w:val="0"/>
+        </w:rPr>
+        <w:t xml:space="preserve">1</w:t>
+      </w:r>
+      <w:r>
+        <w:rPr>
+          <w:sz w:val="24"/>
+          <w:szCs w:val="24"/>
+          <w:rtl w:val="0"/>
+        </w:rPr>
+        <w:t xml:space="preserve">=0.</w:t>
+      </w:r>
+    </w:p>
+    <w:p>
+      <w:pPr>
+        <w:rPr>
+          <w:sz w:val="24"/>
+          <w:szCs w:val="24"/>
+        </w:rPr>
+      </w:pPr>
+      <w:r>
+        <w:rPr>
+          <w:rtl w:val="0"/>
+        </w:rPr>
+      </w:r>
+    </w:p>
+    <w:p>
+      <w:pPr>
+        <w:pStyle w:val="Subtitle"/>
+        <w:rPr/>
+      </w:pPr>
+      <w:bookmarkStart w:colFirst="0" w:colLast="0" w:name="_l2jxanniiku1" w:id="3"/>
+      <w:bookmarkEnd w:id="3"/>
+      <w:r>
+        <w:rPr>
+          <w:rtl w:val="0"/>
+        </w:rPr>
+        <w:t xml:space="preserve">Validation of Known Configurations</w:t>
+      </w:r>
+    </w:p>
+    <w:p>
+      <w:pPr>
+        <w:rPr/>
+      </w:pPr>
+      <w:r>
+        <w:rPr>
+          <w:rtl w:val="0"/>
+        </w:rPr>
+      </w:r>
+    </w:p>
+    <w:tbl>
+      <w:tblPr>
+        <w:tblStyle w:val="Table2"/>
+        <w:tblW w:w="9600.0" w:type="dxa"/>
+        <w:jc w:val="left"/>
+        <w:tblBorders>
+          <w:top w:color="000000" w:space="0" w:sz="8" w:val="single"/>
+          <w:left w:color="000000" w:space="0" w:sz="8" w:val="single"/>
+          <w:bottom w:color="000000" w:space="0" w:sz="8" w:val="single"/>
+          <w:right w:color="000000" w:space="0" w:sz="8" w:val="single"/>
+          <w:insideH w:color="000000" w:space="0" w:sz="8" w:val="single"/>
+          <w:insideV w:color="000000" w:space="0" w:sz="8" w:val="single"/>
+        </w:tblBorders>
+        <w:tblLayout w:type="fixed"/>
+        <w:tblLook w:val="0600"/>
+      </w:tblPr>
+      <w:tblGrid>
+        <w:gridCol w:w="2400"/>
+        <w:gridCol w:w="2000"/>
+        <w:gridCol w:w="2000"/>
+        <w:gridCol w:w="2000"/>
+        <w:gridCol w:w="1200"/>
+        <w:tblGridChange w:id="0">
+          <w:tblGrid>
+            <w:gridCol w:w="2400"/>
+            <w:gridCol w:w="2000"/>
+            <w:gridCol w:w="2000"/>
+            <w:gridCol w:w="2000"/>
+            <w:gridCol w:w="1200"/>
+          </w:tblGrid>
+        </w:tblGridChange>
+      </w:tblGrid>
+      <w:tr>
+        <w:trPr>
+          <w:cantSplit w:val="0"/>
+          <w:tblHeader w:val="1"/>
+        </w:trPr>
+        <w:tc>
+          <w:tcPr/>
+          <w:p>
+            <w:pPr>
+              <w:rPr/>
+            </w:pPr>
+            <w:r>
+              <w:rPr>
+                <w:b w:val="1"/>
+                <w:bCs w:val="1"/>
+                <w:rtl w:val="0"/>
+              </w:rPr>
+              <w:t xml:space="preserve">Test Case</w:t>
+            </w:r>
+            <w:r>
+              <w:rPr>
+                <w:rtl w:val="0"/>
+              </w:rPr>
+            </w:r>
+          </w:p>
+        </w:tc>
+        <w:tc>
+          <w:tcPr/>
+          <w:p>
+            <w:pPr>
+              <w:rPr/>
+            </w:pPr>
+            <w:r>
+              <w:rPr>
+                <w:b w:val="1"/>
+                <w:bCs w:val="1"/>
+                <w:rtl w:val="0"/>
+              </w:rPr>
+              <w:t xml:space="preserve">Joint Configuration q (rad)</w:t>
+            </w:r>
+            <w:r>
+              <w:rPr>
+                <w:rtl w:val="0"/>
+              </w:rPr>
+            </w:r>
+          </w:p>
+        </w:tc>
+        <w:tc>
+          <w:tcPr/>
+          <w:p>
+            <w:pPr>
+              <w:rPr/>
+            </w:pPr>
+            <w:r>
+              <w:rPr>
+                <w:b w:val="1"/>
+                <w:bCs w:val="1"/>
+                <w:rtl w:val="0"/>
+              </w:rPr>
+              <w:t xml:space="preserve">Expected Position p (m)</w:t>
+            </w:r>
+            <w:r>
+              <w:rPr>
+                <w:rtl w:val="0"/>
+              </w:rPr>
+            </w:r>
+          </w:p>
+        </w:tc>
+        <w:tc>
+          <w:tcPr/>
+          <w:p>
+            <w:pPr>
+              <w:rPr/>
+            </w:pPr>
+            <w:r>
+              <w:rPr>
+                <w:b w:val="1"/>
+                <w:bCs w:val="1"/>
+                <w:rtl w:val="0"/>
+              </w:rPr>
+              <w:t xml:space="preserve">Computed Position p (m)</w:t>
+            </w:r>
+            <w:r>
+              <w:rPr>
+                <w:rtl w:val="0"/>
+              </w:rPr>
+            </w:r>
+          </w:p>
+        </w:tc>
+        <w:tc>
+          <w:tcPr/>
+          <w:p>
+            <w:pPr>
+              <w:rPr/>
+            </w:pPr>
+            <w:r>
+              <w:rPr>
+                <w:b w:val="1"/>
+                <w:bCs w:val="1"/>
+                <w:rtl w:val="0"/>
+              </w:rPr>
+              <w:t xml:space="preserve">Error (mm)</w:t>
+            </w:r>
+            <w:r>
+              <w:rPr>
+                <w:rtl w:val="0"/>
+              </w:rPr>
+            </w:r>
+          </w:p>
+        </w:tc>
+      </w:tr>
+      <w:tr>
+        <w:trPr>
+          <w:cantSplit w:val="0"/>
+          <w:tblHeader w:val="0"/>
+        </w:trPr>
+        <w:tc>
+          <w:tcPr/>
+          <w:p>
+            <w:pPr>
+              <w:rPr/>
+            </w:pPr>
+            <w:r>
+              <w:rPr>
+                <w:b w:val="1"/>
+                <w:bCs w:val="1"/>
+                <w:rtl w:val="0"/>
+              </w:rPr>
+              <w:t xml:space="preserve">Home (Fully stretched)</w:t>
+            </w:r>
+            <w:r>
+              <w:rPr>
+                <w:rtl w:val="0"/>
+              </w:rPr>
+            </w:r>
+          </w:p>
+        </w:tc>
+        <w:tc>
+          <w:tcPr/>
+          <w:p>
+            <w:pPr>
+              <w:rPr/>
+            </w:pPr>
+            <w:r>
+              <w:rPr>
+                <w:rtl w:val="0"/>
+              </w:rPr>
+              <w:t xml:space="preserve">[0, 0, 0, 0, 0, 0, 0]</w:t>
+            </w:r>
+          </w:p>
+        </w:tc>
+        <w:tc>
+          <w:tcPr/>
+          <w:p>
+            <w:pPr>
+              <w:rPr/>
+            </w:pPr>
+            <w:r>
+              <w:rPr>
+                <w:rtl w:val="0"/>
+              </w:rPr>
+              <w:t xml:space="preserve">[0; 0; 0.926]</w:t>
+            </w:r>
+          </w:p>
+        </w:tc>
+        <w:tc>
+          <w:tcPr/>
+          <w:p>
+            <w:pPr>
+              <w:rPr/>
+            </w:pPr>
+            <w:r>
+              <w:rPr>
+                <w:rtl w:val="0"/>
+              </w:rPr>
+              <w:t xml:space="preserve">[0.000; 0.000; 0.926]</w:t>
+            </w:r>
+          </w:p>
+        </w:tc>
+        <w:tc>
+          <w:tcPr/>
+          <w:p>
+            <w:pPr>
+              <w:rPr/>
+            </w:pPr>
+            <w:r>
+              <w:rPr>
+                <w:rtl w:val="0"/>
+              </w:rPr>
+              <w:t xml:space="preserve">0.00</w:t>
+            </w:r>
+          </w:p>
+        </w:tc>
+      </w:tr>
+      <w:tr>
+        <w:trPr>
+          <w:cantSplit w:val="0"/>
+          <w:tblHeader w:val="0"/>
+        </w:trPr>
+        <w:tc>
+          <w:tcPr/>
+          <w:p>
+            <w:pPr>
+              <w:rPr/>
+            </w:pPr>
+            <w:r>
+              <w:rPr>
+                <w:b w:val="1"/>
+                <w:bCs w:val="1"/>
+                <w:rtl w:val="0"/>
+              </w:rPr>
+              <w:t xml:space="preserve">Shoulder Bend</w:t>
+            </w:r>
+            <w:r>
+              <w:rPr>
+                <w:rtl w:val="0"/>
+              </w:rPr>
+            </w:r>
+          </w:p>
+        </w:tc>
+        <w:tc>
+          <w:tcPr/>
+          <w:p>
+            <w:pPr>
+              <w:rPr/>
+            </w:pPr>
+            <w:r>
+              <w:rPr>
+                <w:rtl w:val="0"/>
+              </w:rPr>
+              <w:t xml:space="preserve">[0, 1.57, 0, 0, 0, 0, 0]</w:t>
+            </w:r>
+          </w:p>
+        </w:tc>
+        <w:tc>
+          <w:tcPr/>
+          <w:p>
+            <w:pPr>
+              <w:rPr/>
+            </w:pPr>
+            <w:r>
+              <w:rPr>
+                <w:rtl w:val="0"/>
+              </w:rPr>
+              <w:t xml:space="preserve">[-0.926; 0; 0]</w:t>
+            </w:r>
+          </w:p>
+        </w:tc>
+        <w:tc>
+          <w:tcPr/>
+          <w:p>
+            <w:pPr>
+              <w:rPr/>
+            </w:pPr>
+            <w:r>
+              <w:rPr>
+                <w:rtl w:val="0"/>
+              </w:rPr>
+              <w:t xml:space="preserve">[-0.926; 0.000; 0.000]</w:t>
+            </w:r>
+          </w:p>
+        </w:tc>
+        <w:tc>
+          <w:tcPr/>
+          <w:p>
+            <w:pPr>
+              <w:rPr/>
+            </w:pPr>
+            <w:r>
+              <w:rPr>
+                <w:rtl w:val="0"/>
+              </w:rPr>
+              <w:t xml:space="preserve">0.00</w:t>
+            </w:r>
+          </w:p>
+        </w:tc>
+      </w:tr>
+      <w:tr>
+        <w:trPr>
+          <w:cantSplit w:val="0"/>
+          <w:tblHeader w:val="0"/>
+        </w:trPr>
+        <w:tc>
+          <w:tcPr/>
+          <w:p>
+            <w:pPr>
+              <w:rPr/>
+            </w:pPr>
+            <w:r>
+              <w:rPr>
+                <w:b w:val="1"/>
+                <w:bCs w:val="1"/>
+                <w:rtl w:val="0"/>
+              </w:rPr>
+              <w:t xml:space="preserve">L-Shape </w:t>
+            </w:r>
+            <w:r>
+              <w:rPr>
+                <w:b w:val="1"/>
+                <w:bCs w:val="1"/>
+                <w:rtl w:val="0"/>
+              </w:rPr>
+              <w:t xml:space="preserve">Bend</w:t>
+            </w:r>
+            <w:r>
+              <w:rPr>
+                <w:rtl w:val="0"/>
+              </w:rPr>
+            </w:r>
+          </w:p>
+        </w:tc>
+        <w:tc>
+          <w:tcPr/>
+          <w:p>
+            <w:pPr>
+              <w:rPr/>
+            </w:pPr>
+            <w:r>
+              <w:rPr>
+                <w:rtl w:val="0"/>
+              </w:rPr>
+              <w:t xml:space="preserve">[0, 0, 0, -1.57, 0, 0, 0]</w:t>
+            </w:r>
+          </w:p>
+        </w:tc>
+        <w:tc>
+          <w:tcPr/>
+          <w:p>
+            <w:pPr>
+              <w:rPr/>
+            </w:pPr>
+            <w:r>
+              <w:rPr>
+                <w:rtl w:val="0"/>
+              </w:rPr>
+              <w:t xml:space="preserve">[-0.526; 0; 0.400]</w:t>
+            </w:r>
+          </w:p>
+        </w:tc>
+        <w:tc>
+          <w:tcPr/>
+          <w:p>
+            <w:pPr>
+              <w:rPr/>
+            </w:pPr>
+            <w:r>
+              <w:rPr>
+                <w:rtl w:val="0"/>
+              </w:rPr>
+              <w:t xml:space="preserve">[-0.526; 0.000; 0.400]</w:t>
+            </w:r>
+          </w:p>
+        </w:tc>
+        <w:tc>
+          <w:tcPr/>
+          <w:p>
+            <w:pPr>
+              <w:rPr/>
+            </w:pPr>
+            <w:r>
+              <w:rPr>
+                <w:rtl w:val="0"/>
+              </w:rPr>
+              <w:t xml:space="preserve">0.00</w:t>
+            </w:r>
+          </w:p>
+        </w:tc>
+      </w:tr>
+    </w:tbl>
+    <w:p>
+      <w:pPr>
+        <w:pStyle w:val="Subtitle"/>
+        <w:rPr/>
+      </w:pPr>
+      <w:bookmarkStart w:colFirst="0" w:colLast="0" w:name="_tkdjiuz2e30r" w:id="4"/>
+      <w:bookmarkEnd w:id="4"/>
+      <w:r>
+        <w:rPr>
+          <w:rtl w:val="0"/>
+        </w:rPr>
+        <w:t xml:space="preserve"> </w:t>
+      </w:r>
+    </w:p>
+    <w:p>
+      <w:pPr>
+        <w:rPr>
+          <w:i w:val="1"/>
+          <w:iCs w:val="1"/>
+        </w:rPr>
+      </w:pPr>
+      <w:r>
+        <w:rPr>
+          <w:i w:val="1"/>
+          <w:iCs w:val="1"/>
+          <w:rtl w:val="0"/>
+        </w:rPr>
+        <w:t xml:space="preserve">See annex A for Visual representation of test cases</w:t>
+      </w:r>
+      <w:r>
+        <w:rPr>
+          <w:rtl w:val="0"/>
+        </w:rPr>
+      </w:r>
+    </w:p>
+    <w:p>
+      <w:pPr>
+        <w:pStyle w:val="Subtitle"/>
+        <w:rPr/>
+      </w:pPr>
+      <w:bookmarkStart w:colFirst="0" w:colLast="0" w:name="_i878c48nsm3p" w:id="5"/>
+      <w:bookmarkEnd w:id="5"/>
+      <w:r>
+        <w:rPr>
+          <w:rtl w:val="0"/>
+        </w:rPr>
+        <w:t xml:space="preserve">Analysis</w:t>
+      </w:r>
+    </w:p>
+    <w:p>
+      <w:pPr>
+        <w:rPr/>
+      </w:pPr>
+      <w:r>
+        <w:rPr>
+          <w:rtl w:val="0"/>
+        </w:rPr>
+      </w:r>
+    </w:p>
+    <w:p>
+      <w:pPr>
+        <w:rPr>
+          <w:sz w:val="24"/>
+          <w:szCs w:val="24"/>
+        </w:rPr>
+      </w:pPr>
+      <w:r>
+        <w:rPr>
+          <w:sz w:val="24"/>
+          <w:szCs w:val="24"/>
+          <w:rtl w:val="0"/>
+        </w:rPr>
+        <w:t xml:space="preserve">The Direct Kinematics model perfectly matched the geometric expectations with a numerical error of zero for all tested configurations. The result confirms that the D-H table and the subsequent matrix multiplications accurately represent the physical dimensions of the KUKA LBR MED.</w:t>
+      </w:r>
+      <w:r>
+        <w:rPr>
+          <w:rtl w:val="0"/>
+        </w:rPr>
+      </w:r>
+    </w:p>
+    <w:p>
+      <w:pPr>
+        <w:jc w:val="left"/>
+        <w:rPr>
+          <w:b w:val="1"/>
+          <w:bCs w:val="1"/>
+          <w:sz w:val="24"/>
+          <w:szCs w:val="24"/>
+        </w:rPr>
+      </w:pPr>
+      <w:r>
+        <w:rPr>
+          <w:rtl w:val="0"/>
+        </w:rPr>
+      </w:r>
+    </w:p>
+    <w:p>
+      <w:pPr>
+        <w:pStyle w:val="Heading2"/>
+        <w:rPr/>
+      </w:pPr>
+      <w:bookmarkStart w:colFirst="0" w:colLast="0" w:name="_h29s1ukdff2d" w:id="6"/>
+      <w:bookmarkEnd w:id="6"/>
+      <w:r>
+        <w:rPr>
+          <w:rtl w:val="0"/>
+        </w:rPr>
+        <w:t xml:space="preserve">Step 3:</w:t>
+      </w:r>
+    </w:p>
+    <w:p>
+      <w:pPr>
+        <w:rPr>
+          <w:b w:val="1"/>
+          <w:bCs w:val="1"/>
+          <w:sz w:val="24"/>
+          <w:szCs w:val="24"/>
+          <w:u w:val="single"/>
+        </w:rPr>
+      </w:pPr>
+      <w:r>
+        <w:rPr>
+          <w:b w:val="1"/>
+          <w:bCs w:val="1"/>
+          <w:sz w:val="24"/>
+          <w:szCs w:val="24"/>
+          <w:rtl w:val="0"/>
+        </w:rPr>
+        <w:br w:type="textWrapping"/>
+      </w:r>
+      <w:r>
+        <w:rPr>
+          <w:b w:val="1"/>
+          <w:bCs w:val="1"/>
+          <w:sz w:val="24"/>
+          <w:szCs w:val="24"/>
+          <w:u w:val="single"/>
+          <w:rtl w:val="0"/>
+        </w:rPr>
+        <w:t xml:space="preserve">Inverse Kinematics</w:t>
+      </w:r>
+    </w:p>
+    <w:p>
+      <w:pPr>
+        <w:rPr>
+          <w:sz w:val="24"/>
+          <w:szCs w:val="24"/>
+        </w:rPr>
+      </w:pPr>
+      <w:r>
+        <w:rPr>
+          <w:rtl w:val="0"/>
+        </w:rPr>
+      </w:r>
+    </w:p>
+    <w:p>
+      <w:pPr>
+        <w:rPr>
+          <w:sz w:val="24"/>
+          <w:szCs w:val="24"/>
+        </w:rPr>
+      </w:pPr>
+      <w:r>
+        <w:rPr>
+          <w:sz w:val="24"/>
+          <w:szCs w:val="24"/>
+          <w:rtl w:val="0"/>
+        </w:rPr>
+        <w:t xml:space="preserve">In this step, a closed-form analytical Inverse Kinematics (IK) solver was developed. Since the KUKA LBR MED is a 7-DOF redundant manipulator, the system is underconstrained for a standard 6-DOF task (position and orientation). </w:t>
+      </w:r>
+    </w:p>
+    <w:p>
+      <w:pPr>
+        <w:rPr>
+          <w:sz w:val="24"/>
+          <w:szCs w:val="24"/>
+        </w:rPr>
+      </w:pPr>
+      <w:r>
+        <w:rPr>
+          <w:sz w:val="24"/>
+          <w:szCs w:val="24"/>
+          <w:rtl w:val="0"/>
+        </w:rPr>
+        <w:t xml:space="preserve">To obtain a deterministic closed-form solution, the redundancy was parameterized using the elbow angle </w:t>
+      </w:r>
+      <m:oMath>
+        <m:sSub>
+          <m:sSubPr>
+            <m:ctrlPr>
+              <w:rPr>
+                <w:sz w:val="24"/>
+                <w:szCs w:val="24"/>
+              </w:rPr>
+            </m:ctrlPr>
+          </m:sSubPr>
+          <m:e>
+            <m:r>
+              <w:rPr>
+                <w:sz w:val="24"/>
+                <w:szCs w:val="24"/>
+              </w:rPr>
+              <m:t xml:space="preserve">q</m:t>
+            </m:r>
+          </m:e>
+          <m:sub>
+            <m:r>
+              <w:rPr>
+                <w:sz w:val="24"/>
+                <w:szCs w:val="24"/>
+              </w:rPr>
+              <m:t xml:space="preserve">4</m:t>
+            </m:r>
+          </m:sub>
+        </m:sSub>
+      </m:oMath>
+      <w:r>
+        <w:rPr>
+          <w:sz w:val="24"/>
+          <w:szCs w:val="24"/>
+          <w:rtl w:val="0"/>
+        </w:rPr>
+        <w:t xml:space="preserve">, effectively decoupling the system. The wrist joints were then solved using an intrinsic Z-Y-Z Euler angle decomposition.</w:t>
+      </w:r>
+    </w:p>
+    <w:p>
+      <w:pPr>
+        <w:rPr>
+          <w:sz w:val="24"/>
+          <w:szCs w:val="24"/>
+        </w:rPr>
+      </w:pPr>
+      <w:r>
+        <w:rPr>
+          <w:rtl w:val="0"/>
+        </w:rPr>
+      </w:r>
+    </w:p>
+    <w:p>
+      <w:pPr>
+        <w:pStyle w:val="Subtitle"/>
+        <w:rPr/>
+      </w:pPr>
+      <w:bookmarkStart w:colFirst="0" w:colLast="0" w:name="_9wohayjhf6k1" w:id="7"/>
+      <w:bookmarkEnd w:id="7"/>
+      <w:r>
+        <w:rPr>
+          <w:rtl w:val="0"/>
+        </w:rPr>
+        <w:t xml:space="preserve">Validation of Known Configurations</w:t>
+        <w:br w:type="textWrapping"/>
+      </w:r>
+    </w:p>
+    <w:p>
+      <w:pPr>
+        <w:rPr>
+          <w:sz w:val="24"/>
+          <w:szCs w:val="24"/>
+        </w:rPr>
+      </w:pPr>
+      <w:r>
+        <w:rPr>
+          <w:sz w:val="24"/>
+          <w:szCs w:val="24"/>
+          <w:rtl w:val="0"/>
+        </w:rPr>
+        <w:t xml:space="preserve">The solver was validated using a "round-trip" test: a set of joint angles </w:t>
+      </w:r>
+      <m:oMath>
+        <m:sSub>
+          <m:sSubPr>
+            <m:ctrlPr>
+              <w:rPr>
+                <w:sz w:val="24"/>
+                <w:szCs w:val="24"/>
+              </w:rPr>
+            </m:ctrlPr>
+          </m:sSubPr>
+          <m:e>
+            <m:r>
+              <w:rPr>
+                <w:sz w:val="24"/>
+                <w:szCs w:val="24"/>
+              </w:rPr>
+              <m:t xml:space="preserve">q</m:t>
+            </m:r>
+          </m:e>
+          <m:sub>
+            <m:r>
+              <w:rPr>
+                <w:sz w:val="24"/>
+                <w:szCs w:val="24"/>
+              </w:rPr>
+              <m:t xml:space="preserve">orig</m:t>
+            </m:r>
+          </m:sub>
+        </m:sSub>
+      </m:oMath>
+      <w:r>
+        <w:rPr>
+          <w:sz w:val="24"/>
+          <w:szCs w:val="24"/>
+          <w:rtl w:val="0"/>
+        </w:rPr>
+        <w:t xml:space="preserve"> was used to generate a target pose </w:t>
+      </w:r>
+      <m:oMath>
+        <m:sSub>
+          <m:sSubPr>
+            <m:ctrlPr>
+              <w:rPr>
+                <w:sz w:val="24"/>
+                <w:szCs w:val="24"/>
+              </w:rPr>
+            </m:ctrlPr>
+          </m:sSubPr>
+          <m:e>
+            <m:r>
+              <w:rPr>
+                <w:sz w:val="24"/>
+                <w:szCs w:val="24"/>
+              </w:rPr>
+              <m:t xml:space="preserve">T</m:t>
+            </m:r>
+          </m:e>
+          <m:sub>
+            <m:r>
+              <w:rPr>
+                <w:sz w:val="24"/>
+                <w:szCs w:val="24"/>
+              </w:rPr>
+              <m:t xml:space="preserve">goal</m:t>
+            </m:r>
+          </m:sub>
+        </m:sSub>
+      </m:oMath>
+      <w:r>
+        <w:rPr>
+          <w:sz w:val="24"/>
+          <w:szCs w:val="24"/>
+          <w:rtl w:val="0"/>
+        </w:rPr>
+        <w:t xml:space="preserve"> via the DK model. This target was fed into the IK solver to produce a joint solution  </w:t>
+      </w:r>
+      <m:oMath>
+        <m:sSub>
+          <m:sSubPr>
+            <m:ctrlPr>
+              <w:rPr>
+                <w:sz w:val="24"/>
+                <w:szCs w:val="24"/>
+              </w:rPr>
+            </m:ctrlPr>
+          </m:sSubPr>
+          <m:e>
+            <m:r>
+              <w:rPr>
+                <w:sz w:val="24"/>
+                <w:szCs w:val="24"/>
+              </w:rPr>
+              <m:t xml:space="preserve">q</m:t>
+            </m:r>
+          </m:e>
+          <m:sub>
+            <m:r>
+              <w:rPr>
+                <w:sz w:val="24"/>
+                <w:szCs w:val="24"/>
+              </w:rPr>
+              <m:t xml:space="preserve">inv</m:t>
+            </m:r>
+          </m:sub>
+        </m:sSub>
+      </m:oMath>
+      <w:r>
+        <w:rPr>
+          <w:sz w:val="24"/>
+          <w:szCs w:val="24"/>
+          <w:rtl w:val="0"/>
+        </w:rPr>
+        <w:t xml:space="preserve">, which was then passed back through the DK model to obtain  </w:t>
+      </w:r>
+      <m:oMath>
+        <m:sSub>
+          <m:sSubPr>
+            <m:ctrlPr>
+              <w:rPr>
+                <w:sz w:val="24"/>
+                <w:szCs w:val="24"/>
+              </w:rPr>
+            </m:ctrlPr>
+          </m:sSubPr>
+          <m:e>
+            <m:r>
+              <w:rPr>
+                <w:sz w:val="24"/>
+                <w:szCs w:val="24"/>
+              </w:rPr>
+              <m:t xml:space="preserve">T</m:t>
+            </m:r>
+          </m:e>
+          <m:sub>
+            <m:r>
+              <w:rPr>
+                <w:sz w:val="24"/>
+                <w:szCs w:val="24"/>
+              </w:rPr>
+              <m:t xml:space="preserve">check</m:t>
+            </m:r>
+          </m:sub>
+        </m:sSub>
+      </m:oMath>
+      <w:r>
+        <w:rPr>
+          <w:rtl w:val="0"/>
+        </w:rPr>
+      </w:r>
+    </w:p>
+    <w:p>
+      <w:pPr>
+        <w:rPr/>
+      </w:pPr>
+      <w:r>
+        <w:rPr>
+          <w:rtl w:val="0"/>
+        </w:rPr>
+      </w:r>
+    </w:p>
+    <w:p>
+      <w:pPr>
+        <w:rPr/>
+      </w:pPr>
+      <w:r>
+        <w:rPr>
+          <w:rtl w:val="0"/>
+        </w:rPr>
+      </w:r>
+    </w:p>
+    <w:tbl>
+      <w:tblPr>
+        <w:tblStyle w:val="Table3"/>
+        <w:tblW w:w="9600.0" w:type="dxa"/>
+        <w:jc w:val="left"/>
+        <w:tblBorders>
+          <w:top w:color="000000" w:space="0" w:sz="8" w:val="single"/>
+          <w:left w:color="000000" w:space="0" w:sz="8" w:val="single"/>
+          <w:bottom w:color="000000" w:space="0" w:sz="8" w:val="single"/>
+          <w:right w:color="000000" w:space="0" w:sz="8" w:val="single"/>
+          <w:insideH w:color="000000" w:space="0" w:sz="8" w:val="single"/>
+          <w:insideV w:color="000000" w:space="0" w:sz="8" w:val="single"/>
+        </w:tblBorders>
+        <w:tblLayout w:type="fixed"/>
+        <w:tblLook w:val="0600"/>
+      </w:tblPr>
+      <w:tblGrid>
+        <w:gridCol w:w="2400"/>
+        <w:gridCol w:w="2000"/>
+        <w:gridCol w:w="2000"/>
+        <w:gridCol w:w="2000"/>
+        <w:gridCol w:w="1200"/>
+        <w:tblGridChange w:id="0">
+          <w:tblGrid>
+            <w:gridCol w:w="2400"/>
+            <w:gridCol w:w="2000"/>
+            <w:gridCol w:w="2000"/>
+            <w:gridCol w:w="2000"/>
+            <w:gridCol w:w="1200"/>
+          </w:tblGrid>
+        </w:tblGridChange>
+      </w:tblGrid>
+      <w:tr>
+        <w:trPr>
+          <w:cantSplit w:val="0"/>
+          <w:tblHeader w:val="1"/>
+        </w:trPr>
+        <w:tc>
+          <w:tcPr/>
+          <w:p>
+            <w:pPr>
+              <w:rPr/>
+            </w:pPr>
+            <w:r>
+              <w:rPr>
+                <w:b w:val="1"/>
+                <w:bCs w:val="1"/>
+                <w:rtl w:val="0"/>
+              </w:rPr>
+              <w:t xml:space="preserve">Test Case</w:t>
+            </w:r>
+            <w:r>
+              <w:rPr>
+                <w:rtl w:val="0"/>
+              </w:rPr>
+            </w:r>
+          </w:p>
+        </w:tc>
+        <w:tc>
+          <w:tcPr/>
+          <w:p>
+            <w:pPr>
+              <w:rPr/>
+            </w:pPr>
+            <w:r>
+              <w:rPr>
+                <w:b w:val="1"/>
+                <w:bCs w:val="1"/>
+                <w:rtl w:val="0"/>
+              </w:rPr>
+              <w:t xml:space="preserve">Original Joints </w:t>
+            </w:r>
+            <m:oMath>
+              <m:sSub>
+                <m:sSubPr>
+                  <m:ctrlPr>
+                    <w:rPr>
+                      <w:b w:val="1"/>
+                      <w:bCs w:val="1"/>
+                    </w:rPr>
+                  </m:ctrlPr>
+                </m:sSubPr>
+                <m:e>
+                  <m:r>
+                    <w:rPr>
+                      <w:b w:val="1"/>
+                      <w:bCs w:val="1"/>
+                    </w:rPr>
+                    <m:t xml:space="preserve">q</m:t>
+                  </m:r>
+                </m:e>
+                <m:sub>
+                  <m:r>
+                    <w:rPr>
+                      <w:b w:val="1"/>
+                      <w:bCs w:val="1"/>
+                    </w:rPr>
+                    <m:t xml:space="preserve">orig</m:t>
+                  </m:r>
+                </m:sub>
+              </m:sSub>
+            </m:oMath>
+            <w:r>
+              <w:rPr>
+                <w:b w:val="1"/>
+                <w:bCs w:val="1"/>
+                <w:rtl w:val="0"/>
+              </w:rPr>
+              <w:t xml:space="preserve"> (rad)</w:t>
+            </w:r>
+            <w:r>
+              <w:rPr>
+                <w:rtl w:val="0"/>
+              </w:rPr>
+            </w:r>
+          </w:p>
+        </w:tc>
+        <w:tc>
+          <w:tcPr/>
+          <w:p>
+            <w:pPr>
+              <w:rPr/>
+            </w:pPr>
+            <w:r>
+              <w:rPr>
+                <w:b w:val="1"/>
+                <w:bCs w:val="1"/>
+                <w:rtl w:val="0"/>
+              </w:rPr>
+              <w:t xml:space="preserve">IK Solution </w:t>
+            </w:r>
+            <m:oMath>
+              <m:sSub>
+                <m:sSubPr>
+                  <m:ctrlPr>
+                    <w:rPr>
+                      <w:b w:val="1"/>
+                      <w:bCs w:val="1"/>
+                    </w:rPr>
+                  </m:ctrlPr>
+                </m:sSubPr>
+                <m:e>
+                  <m:r>
+                    <w:rPr>
+                      <w:b w:val="1"/>
+                      <w:bCs w:val="1"/>
+                    </w:rPr>
+                    <m:t xml:space="preserve">q</m:t>
+                  </m:r>
+                </m:e>
+                <m:sub>
+                  <m:r>
+                    <w:rPr>
+                      <w:b w:val="1"/>
+                      <w:bCs w:val="1"/>
+                    </w:rPr>
+                    <m:t xml:space="preserve">inv</m:t>
+                  </m:r>
+                </m:sub>
+              </m:sSub>
+            </m:oMath>
+            <w:r>
+              <w:rPr>
+                <w:b w:val="1"/>
+                <w:bCs w:val="1"/>
+                <w:rtl w:val="0"/>
+              </w:rPr>
+              <w:t xml:space="preserve">(rad)</w:t>
+            </w:r>
+            <w:r>
+              <w:rPr>
+                <w:rtl w:val="0"/>
+              </w:rPr>
+            </w:r>
+          </w:p>
+        </w:tc>
+        <w:tc>
+          <w:tcPr/>
+          <w:p>
+            <w:pPr>
+              <w:rPr/>
+            </w:pPr>
+            <w:r>
+              <w:rPr>
+                <w:b w:val="1"/>
+                <w:bCs w:val="1"/>
+                <w:rtl w:val="0"/>
+              </w:rPr>
+              <w:t xml:space="preserve">Final Pos. Error (mm)</w:t>
+            </w:r>
+            <w:r>
+              <w:rPr>
+                <w:rtl w:val="0"/>
+              </w:rPr>
+            </w:r>
+          </w:p>
+        </w:tc>
+        <w:tc>
+          <w:tcPr/>
+          <w:p>
+            <w:pPr>
+              <w:rPr/>
+            </w:pPr>
+            <w:r>
+              <w:rPr>
+                <w:b w:val="1"/>
+                <w:bCs w:val="1"/>
+                <w:rtl w:val="0"/>
+              </w:rPr>
+              <w:t xml:space="preserve">Final Ori. Error (rad)</w:t>
+            </w:r>
+            <w:r>
+              <w:rPr>
+                <w:rtl w:val="0"/>
+              </w:rPr>
+            </w:r>
+          </w:p>
+        </w:tc>
+      </w:tr>
+      <w:tr>
+        <w:trPr>
+          <w:cantSplit w:val="0"/>
+          <w:tblHeader w:val="0"/>
+        </w:trPr>
+        <w:tc>
+          <w:tcPr/>
+          <w:p>
+            <w:pPr>
+              <w:rPr/>
+            </w:pPr>
+            <w:r>
+              <w:rPr>
+                <w:b w:val="1"/>
+                <w:bCs w:val="1"/>
+                <w:rtl w:val="0"/>
+              </w:rPr>
+              <w:t xml:space="preserve">Home Position</w:t>
+            </w:r>
+            <w:r>
+              <w:rPr>
+                <w:rtl w:val="0"/>
+              </w:rPr>
+            </w:r>
+          </w:p>
+        </w:tc>
+        <w:tc>
+          <w:tcPr/>
+          <w:p>
+            <w:pPr>
+              <w:rPr/>
+            </w:pPr>
+            <w:r>
+              <w:rPr>
+                <w:rtl w:val="0"/>
+              </w:rPr>
+              <w:t xml:space="preserve">[0, 0, 0, 0, 0, 0, 0]</w:t>
+            </w:r>
+          </w:p>
+        </w:tc>
+        <w:tc>
+          <w:tcPr/>
+          <w:p>
+            <w:pPr>
+              <w:rPr/>
+            </w:pPr>
+            <w:r>
+              <w:rPr>
+                <w:rtl w:val="0"/>
+              </w:rPr>
+              <w:t xml:space="preserve">[0, 0, 0, 0, 0, 0, 0]</w:t>
+            </w:r>
+          </w:p>
+        </w:tc>
+        <w:tc>
+          <w:tcPr/>
+          <w:p>
+            <w:pPr>
+              <w:rPr/>
+            </w:pPr>
+            <w:r>
+              <w:rPr>
+                <w:rtl w:val="0"/>
+              </w:rPr>
+              <w:t xml:space="preserve">0.00</w:t>
+            </w:r>
+          </w:p>
+        </w:tc>
+        <w:tc>
+          <w:tcPr/>
+          <w:p>
+            <w:pPr>
+              <w:rPr/>
+            </w:pPr>
+            <w:r>
+              <w:rPr>
+                <w:rtl w:val="0"/>
+              </w:rPr>
+              <w:t xml:space="preserve">0.00</w:t>
+            </w:r>
+          </w:p>
+        </w:tc>
+      </w:tr>
+      <w:tr>
+        <w:trPr>
+          <w:cantSplit w:val="0"/>
+          <w:tblHeader w:val="0"/>
+        </w:trPr>
+        <w:tc>
+          <w:tcPr/>
+          <w:p>
+            <w:pPr>
+              <w:rPr/>
+            </w:pPr>
+            <w:r>
+              <w:rPr>
+                <w:b w:val="1"/>
+                <w:bCs w:val="1"/>
+                <w:rtl w:val="0"/>
+              </w:rPr>
+              <w:t xml:space="preserve">Elbow Bend</w:t>
+            </w:r>
+            <w:r>
+              <w:rPr>
+                <w:rtl w:val="0"/>
+              </w:rPr>
+            </w:r>
+          </w:p>
+        </w:tc>
+        <w:tc>
+          <w:tcPr/>
+          <w:p>
+            <w:pPr>
+              <w:rPr/>
+            </w:pPr>
+            <w:r>
+              <w:rPr>
+                <w:rtl w:val="0"/>
+              </w:rPr>
+              <w:t xml:space="preserve">[0, 0.78, 0, 1.04, 0, 0.52, 0]</w:t>
+            </w:r>
+          </w:p>
+        </w:tc>
+        <w:tc>
+          <w:tcPr/>
+          <w:p>
+            <w:pPr>
+              <w:rPr/>
+            </w:pPr>
+            <w:r>
+              <w:rPr>
+                <w:rtl w:val="0"/>
+              </w:rPr>
+              <w:t xml:space="preserve">[0, 0.78, 0, 1.04, 0, 0.52, 0]</w:t>
+            </w:r>
+          </w:p>
+        </w:tc>
+        <w:tc>
+          <w:tcPr/>
+          <w:p>
+            <w:pPr>
+              <w:rPr/>
+            </w:pPr>
+            <w:r>
+              <w:rPr>
+                <w:rtl w:val="0"/>
+              </w:rPr>
+              <w:t xml:space="preserve">&lt; 1.0e-12</w:t>
+            </w:r>
+          </w:p>
+        </w:tc>
+        <w:tc>
+          <w:tcPr/>
+          <w:p>
+            <w:pPr>
+              <w:rPr/>
+            </w:pPr>
+            <w:r>
+              <w:rPr>
+                <w:rtl w:val="0"/>
+              </w:rPr>
+              <w:t xml:space="preserve">&lt; 1.0e-14</w:t>
+            </w:r>
+          </w:p>
+        </w:tc>
+      </w:tr>
+      <w:tr>
+        <w:trPr>
+          <w:cantSplit w:val="0"/>
+          <w:tblHeader w:val="0"/>
+        </w:trPr>
+        <w:tc>
+          <w:tcPr/>
+          <w:p>
+            <w:pPr>
+              <w:rPr/>
+            </w:pPr>
+            <w:r>
+              <w:rPr>
+                <w:b w:val="1"/>
+                <w:bCs w:val="1"/>
+                <w:rtl w:val="0"/>
+              </w:rPr>
+              <w:t xml:space="preserve">Random Config.</w:t>
+            </w:r>
+            <w:r>
+              <w:rPr>
+                <w:rtl w:val="0"/>
+              </w:rPr>
+            </w:r>
+          </w:p>
+        </w:tc>
+        <w:tc>
+          <w:tcPr/>
+          <w:p>
+            <w:pPr>
+              <w:rPr/>
+            </w:pPr>
+            <w:r>
+              <w:rPr>
+                <w:i w:val="1"/>
+                <w:iCs w:val="1"/>
+                <w:rtl w:val="0"/>
+              </w:rPr>
+              <w:t xml:space="preserve">Randomized bounded set</w:t>
+            </w:r>
+            <w:r>
+              <w:rPr>
+                <w:rtl w:val="0"/>
+              </w:rPr>
+            </w:r>
+          </w:p>
+        </w:tc>
+        <w:tc>
+          <w:tcPr/>
+          <w:p>
+            <w:pPr>
+              <w:rPr/>
+            </w:pPr>
+            <w:r>
+              <w:rPr>
+                <w:i w:val="1"/>
+                <w:iCs w:val="1"/>
+                <w:rtl w:val="0"/>
+              </w:rPr>
+              <w:t xml:space="preserve">Solved valid set</w:t>
+            </w:r>
+            <w:r>
+              <w:rPr>
+                <w:rtl w:val="0"/>
+              </w:rPr>
+            </w:r>
+          </w:p>
+        </w:tc>
+        <w:tc>
+          <w:tcPr/>
+          <w:p>
+            <w:pPr>
+              <w:rPr/>
+            </w:pPr>
+            <w:r>
+              <w:rPr>
+                <w:rtl w:val="0"/>
+              </w:rPr>
+              <w:t xml:space="preserve">&lt; 1.0e-12</w:t>
+            </w:r>
+          </w:p>
+        </w:tc>
+        <w:tc>
+          <w:tcPr/>
+          <w:p>
+            <w:pPr>
+              <w:rPr/>
+            </w:pPr>
+            <w:r>
+              <w:rPr>
+                <w:rtl w:val="0"/>
+              </w:rPr>
+              <w:t xml:space="preserve">&lt; 1.0e-14</w:t>
+            </w:r>
+          </w:p>
+        </w:tc>
+      </w:tr>
+    </w:tbl>
+    <w:p>
+      <w:pPr>
+        <w:rPr/>
+      </w:pPr>
+      <w:r>
+        <w:rPr>
+          <w:rtl w:val="0"/>
+        </w:rPr>
+      </w:r>
+    </w:p>
+    <w:p>
+      <w:pPr>
+        <w:rPr>
+          <w:b w:val="0"/>
+          <w:bCs w:val="0"/>
+          <w:i w:val="1"/>
+          <w:iCs w:val="1"/>
+        </w:rPr>
+      </w:pPr>
+      <w:r>
+        <w:rPr>
+          <w:i w:val="1"/>
+          <w:iCs w:val="1"/>
+          <w:rtl w:val="0"/>
+        </w:rPr>
+        <w:t xml:space="preserve">See annex A for Visual representation of test cases</w:t>
+      </w:r>
+      <w:r>
+        <w:rPr>
+          <w:rtl w:val="0"/>
+        </w:rPr>
+      </w:r>
+    </w:p>
+    <w:p>
+      <w:pPr>
+        <w:pStyle w:val="Subtitle"/>
+        <w:rPr/>
+      </w:pPr>
+      <w:bookmarkStart w:colFirst="0" w:colLast="0" w:name="_10oy9cw9fup1" w:id="8"/>
+      <w:bookmarkEnd w:id="8"/>
+      <w:r>
+        <w:rPr>
+          <w:rtl w:val="0"/>
+        </w:rPr>
+      </w:r>
+    </w:p>
+    <w:p>
+      <w:pPr>
+        <w:pStyle w:val="Subtitle"/>
+        <w:rPr/>
+      </w:pPr>
+      <w:bookmarkStart w:colFirst="0" w:colLast="0" w:name="_n0e3dwntxqbj" w:id="9"/>
+      <w:bookmarkEnd w:id="9"/>
+      <w:r>
+        <w:rPr>
+          <w:rtl w:val="0"/>
+        </w:rPr>
+        <w:t xml:space="preserve">Analysis</w:t>
+      </w:r>
+    </w:p>
+    <w:p>
+      <w:pPr>
+        <w:rPr/>
+      </w:pPr>
+      <w:r>
+        <w:rPr>
+          <w:rtl w:val="0"/>
+        </w:rPr>
+      </w:r>
+    </w:p>
+    <w:p>
+      <w:pPr>
+        <w:rPr/>
+      </w:pPr>
+      <w:r>
+        <w:rPr>
+          <w:b w:val="0"/>
+          <w:bCs w:val="0"/>
+          <w:sz w:val="24"/>
+          <w:szCs w:val="24"/>
+          <w:rtl w:val="0"/>
+        </w:rPr>
+        <w:t xml:space="preserve">The analytical Inverse Kinematics successfully achieved the target poses with numerical precision (errors at the floating-point limit). In all tests, the orientation and position errors were strictly below 1 mm and 0.01 rad. Furthermore, the solver correctly enforced mathematical domain limits, preventing complex numbers when target points were outside the robot's physical workspace.</w:t>
+      </w:r>
+      <w:r>
+        <w:rPr>
+          <w:rtl w:val="0"/>
+        </w:rPr>
+        <w:br w:type="textWrapping"/>
+      </w:r>
+    </w:p>
+    <w:p>
+      <w:pPr>
+        <w:rPr/>
+      </w:pPr>
+      <w:r>
+        <w:rPr>
+          <w:rtl w:val="0"/>
+        </w:rPr>
+      </w:r>
+    </w:p>
+    <w:p>
+      <w:pPr>
+        <w:pStyle w:val="Heading2"/>
+        <w:rPr>
+          <w:i w:val="1"/>
+          <w:iCs w:val="1"/>
+        </w:rPr>
+      </w:pPr>
+      <w:bookmarkStart w:colFirst="0" w:colLast="0" w:name="_67s6hxd1akcj" w:id="10"/>
+      <w:bookmarkEnd w:id="10"/>
+      <w:r>
+        <w:rPr>
+          <w:rtl w:val="0"/>
+        </w:rPr>
+        <w:t xml:space="preserve">Step 4:</w:t>
+      </w:r>
+      <w:r>
+        <w:rPr>
+          <w:rtl w:val="0"/>
+        </w:rPr>
+      </w:r>
+    </w:p>
+    <w:p>
+      <w:pPr>
+        <w:rPr>
+          <w:i w:val="1"/>
+          <w:iCs w:val="1"/>
+        </w:rPr>
+      </w:pPr>
+      <w:r>
+        <w:rPr>
+          <w:rtl w:val="0"/>
+        </w:rPr>
+      </w:r>
+    </w:p>
+    <w:p>
+      <w:pPr>
+        <w:rPr/>
+      </w:pPr>
+      <w:r>
+        <w:rPr>
+          <w:rtl w:val="0"/>
+        </w:rPr>
+        <w:t xml:space="preserve">In this step, the geometric jacobian was obtained from the direct kinematics model. Since all joints are </w:t>
+      </w:r>
+      <w:r>
+        <w:rPr>
+          <w:rtl w:val="0"/>
+        </w:rPr>
+        <w:t xml:space="preserve">revolute</w:t>
+      </w:r>
+      <w:r>
+        <w:rPr>
+          <w:rtl w:val="0"/>
+        </w:rPr>
+        <w:t xml:space="preserve">, each column of the geometric Jacobian was constructed from the joint rotation axis and the relative position between the joint origin and the end-effector. The upper part of each column represents the linear velocity contribution generated by the joint rotation, while the lower part represents the angular velocity contribution along the joint axis.</w:t>
+      </w:r>
+    </w:p>
+    <w:p>
+      <w:pPr>
+        <w:rPr/>
+      </w:pPr>
+      <w:r>
+        <w:rPr>
+          <w:rtl w:val="0"/>
+        </w:rPr>
+      </w:r>
+    </w:p>
+    <w:p>
+      <w:pPr>
+        <w:jc w:val="center"/>
+        <w:rPr/>
+      </w:pPr>
+      <w:r>
+        <w:rPr/>
+        <w:drawing>
+          <wp:inline distB="114300" distT="114300" distL="114300" distR="114300">
+            <wp:extent cx="2552700" cy="666750"/>
+            <wp:effectExtent b="0" l="0" r="0" t="0"/>
+            <wp:docPr id="9" name="image11.png"/>
+            <a:graphic>
+              <a:graphicData uri="http://schemas.openxmlformats.org/drawingml/2006/picture">
+                <pic:pic>
+                  <pic:nvPicPr>
+                    <pic:cNvPr id="0" name="image11.png"/>
+                    <pic:cNvPicPr preferRelativeResize="0"/>
+                  </pic:nvPicPr>
+                  <pic:blipFill>
+                    <a:blip r:embed="rId7"/>
+                    <a:srcRect b="0" l="0" r="0" t="0"/>
+                    <a:stretch>
+                      <a:fillRect/>
+                    </a:stretch>
+                  </pic:blipFill>
+                  <pic:spPr>
+                    <a:xfrm>
+                      <a:off x="0" y="0"/>
+                      <a:ext cx="2552700" cy="666750"/>
+                    </a:xfrm>
+                    <a:prstGeom prst="rect"/>
+                    <a:ln/>
+                  </pic:spPr>
+                </pic:pic>
+              </a:graphicData>
+            </a:graphic>
+          </wp:inline>
+        </w:drawing>
+      </w:r>
+      <w:r>
+        <w:rPr>
+          <w:rtl w:val="0"/>
+        </w:rPr>
+      </w:r>
+    </w:p>
+    <w:p>
+      <w:pPr>
+        <w:jc w:val="center"/>
+        <w:rPr/>
+      </w:pPr>
+      <w:r>
+        <w:rPr>
+          <w:rtl w:val="0"/>
+        </w:rPr>
+      </w:r>
+    </w:p>
+    <w:p>
+      <w:pPr>
+        <w:jc w:val="left"/>
+        <w:rPr/>
+      </w:pPr>
+      <w:r>
+        <w:rPr>
+          <w:rtl w:val="0"/>
+        </w:rPr>
+        <w:t xml:space="preserve">This gives us a 6 X 7 Jacobian matrix, which is expected because the robot has 7 joints but the end-effector motion is described by 6 spatial velocities.</w:t>
+      </w:r>
+    </w:p>
+    <w:p>
+      <w:pPr>
+        <w:jc w:val="left"/>
+        <w:rPr/>
+      </w:pPr>
+      <w:r>
+        <w:rPr>
+          <w:rtl w:val="0"/>
+        </w:rPr>
+      </w:r>
+    </w:p>
+    <w:p>
+      <w:pPr>
+        <w:jc w:val="left"/>
+        <w:rPr/>
+      </w:pPr>
+      <w:r>
+        <w:rPr>
+          <w:rtl w:val="0"/>
+        </w:rPr>
+        <w:t xml:space="preserve">To check that the expression was correct, the analytical velocity was compared with a numerical derivative of the end-effector position along a smooth joint trajectory. The two results were very close: the maximum linear velocity error was approximately 7.5 10^{-5} m/s, and the angular velocity error stayed below 1.2 10^{-3} rad/s.</w:t>
+      </w:r>
+    </w:p>
+    <w:p>
+      <w:pPr>
+        <w:jc w:val="left"/>
+        <w:rPr/>
+      </w:pPr>
+      <w:r>
+        <w:rPr>
+          <w:rtl w:val="0"/>
+        </w:rPr>
+      </w:r>
+    </w:p>
+    <w:p>
+      <w:pPr>
+        <w:jc w:val="left"/>
+        <w:rPr/>
+      </w:pPr>
+      <w:r>
+        <w:rPr>
+          <w:rtl w:val="0"/>
+        </w:rPr>
+        <w:t xml:space="preserve">The Jacobian was then evaluated in different robot configurations to study singularities. In a generic bent pose, the Jacobian had rank 6, meaning that the end-effector could move freely in all task-space directions. The shoulder and wrist singular configurations also kept rank 6. In these cases, the robot loses part of its internal redundancy, but the end-effector itself does not lose a task-space direction.</w:t>
+      </w:r>
+    </w:p>
+    <w:p>
+      <w:pPr>
+        <w:jc w:val="left"/>
+        <w:rPr/>
+      </w:pPr>
+      <w:r>
+        <w:rPr>
+          <w:rtl w:val="0"/>
+        </w:rPr>
+      </w:r>
+    </w:p>
+    <w:p>
+      <w:pPr>
+        <w:jc w:val="left"/>
+        <w:rPr/>
+      </w:pPr>
+      <w:r>
+        <w:rPr>
+          <w:rtl w:val="0"/>
+        </w:rPr>
+        <w:t xml:space="preserve">In the Simulink, two blocks are used for this part of the project. The ‘Direct_Kinematics’ block receives, separately, the seven joint angles q1 to q7 and computes the end-effector pose, returning the rotation matrix ‘Kuka_R’ and position vector ‘Kuka_p’. The ‘Jacobian’ block receives the joint vector q and returns the matrix ‘J_sym’, which maps joint velocities into end-effector linear and angular velocity. Together, these blocks connect the position model from the previous step with the velocity model required for singularity analysis and later control.</w:t>
+      </w:r>
+    </w:p>
+    <w:p>
+      <w:pPr>
+        <w:jc w:val="left"/>
+        <w:rPr/>
+      </w:pPr>
+      <w:r>
+        <w:rPr>
+          <w:rtl w:val="0"/>
+        </w:rPr>
+      </w:r>
+    </w:p>
+    <w:p>
+      <w:pPr>
+        <w:jc w:val="left"/>
+        <w:rPr/>
+      </w:pPr>
+      <w:r>
+        <w:rPr>
+          <w:rtl w:val="0"/>
+        </w:rPr>
+        <w:t xml:space="preserve">The most important case was the elbow singularity, shown in figure below. When the arm is stretched and q4 = 0, the jacobian rank drops from 6 to 5. Physically, this means the robot can no longer generate motion in one direction at the end-effector, especially along the stretched arm direction, being in a state of singularity.</w:t>
+      </w:r>
+    </w:p>
+    <w:p>
+      <w:pPr>
+        <w:jc w:val="left"/>
+        <w:rPr/>
+      </w:pPr>
+      <w:r>
+        <w:rPr>
+          <w:rtl w:val="0"/>
+        </w:rPr>
+      </w:r>
+    </w:p>
+    <w:p>
+      <w:pPr>
+        <w:jc w:val="left"/>
+        <w:rPr/>
+      </w:pPr>
+      <w:r>
+        <w:rPr>
+          <w:rtl w:val="0"/>
+        </w:rPr>
+      </w:r>
+    </w:p>
+    <w:p>
+      <w:pPr>
+        <w:jc w:val="left"/>
+        <w:rPr/>
+      </w:pPr>
+      <w:r>
+        <w:rPr>
+          <w:rtl w:val="0"/>
+        </w:rPr>
+      </w:r>
+    </w:p>
+    <w:p>
+      <w:pPr>
+        <w:jc w:val="left"/>
+        <w:rPr/>
+      </w:pPr>
+      <w:r>
+        <w:rPr>
+          <w:rtl w:val="0"/>
+        </w:rPr>
+      </w:r>
+    </w:p>
+    <w:p>
+      <w:pPr>
+        <w:jc w:val="left"/>
+        <w:rPr/>
+      </w:pPr>
+      <w:r>
+        <w:rPr>
+          <w:rtl w:val="0"/>
+        </w:rPr>
+      </w:r>
+    </w:p>
+    <w:p>
+      <w:pPr>
+        <w:jc w:val="left"/>
+        <w:rPr/>
+      </w:pPr>
+      <w:r>
+        <w:rPr/>
+        <w:drawing>
+          <wp:inline distB="114300" distT="114300" distL="114300" distR="114300">
+            <wp:extent cx="5760000" cy="4495800"/>
+            <wp:effectExtent b="0" l="0" r="0" t="0"/>
+            <wp:docPr id="13" name="image9.png"/>
+            <a:graphic>
+              <a:graphicData uri="http://schemas.openxmlformats.org/drawingml/2006/picture">
+                <pic:pic>
+                  <pic:nvPicPr>
+                    <pic:cNvPr id="0" name="image9.png"/>
+                    <pic:cNvPicPr preferRelativeResize="0"/>
+                  </pic:nvPicPr>
+                  <pic:blipFill>
+                    <a:blip r:embed="rId8"/>
+                    <a:srcRect b="0" l="0" r="0" t="0"/>
+                    <a:stretch>
+                      <a:fillRect/>
+                    </a:stretch>
+                  </pic:blipFill>
+                  <pic:spPr>
+                    <a:xfrm>
+                      <a:off x="0" y="0"/>
+                      <a:ext cx="5760000" cy="4495800"/>
+                    </a:xfrm>
+                    <a:prstGeom prst="rect"/>
+                    <a:ln/>
+                  </pic:spPr>
+                </pic:pic>
+              </a:graphicData>
+            </a:graphic>
+          </wp:inline>
+        </w:drawing>
+      </w:r>
+      <w:r>
+        <w:rPr>
+          <w:rtl w:val="0"/>
+        </w:rPr>
+      </w:r>
+    </w:p>
+    <w:p>
+      <w:pPr>
+        <w:jc w:val="left"/>
+        <w:rPr/>
+      </w:pPr>
+      <w:r>
+        <w:rPr>
+          <w:rtl w:val="0"/>
+        </w:rPr>
+      </w:r>
+    </w:p>
+    <w:p>
+      <w:pPr>
+        <w:rPr/>
+      </w:pPr>
+      <w:r>
+        <w:rPr>
+          <w:rtl w:val="0"/>
+        </w:rPr>
+      </w:r>
+    </w:p>
+    <w:p>
+      <w:pPr>
+        <w:rPr/>
+      </w:pPr>
+      <w:r>
+        <w:rPr>
+          <w:rtl w:val="0"/>
+        </w:rPr>
+      </w:r>
+    </w:p>
+    <w:tbl>
+      <w:tblPr>
+        <w:tblStyle w:val="Table4"/>
+        <w:tblW w:w="9400.0" w:type="dxa"/>
+        <w:jc w:val="center"/>
+        <w:tblBorders>
+          <w:top w:color="000000" w:space="0" w:sz="8" w:val="single"/>
+          <w:left w:color="000000" w:space="0" w:sz="8" w:val="single"/>
+          <w:bottom w:color="000000" w:space="0" w:sz="8" w:val="single"/>
+          <w:right w:color="000000" w:space="0" w:sz="8" w:val="single"/>
+          <w:insideH w:color="000000" w:space="0" w:sz="8" w:val="single"/>
+          <w:insideV w:color="000000" w:space="0" w:sz="8" w:val="single"/>
+        </w:tblBorders>
+        <w:tblLayout w:type="fixed"/>
+        <w:tblLook w:val="0600"/>
+      </w:tblPr>
+      <w:tblGrid>
+        <w:gridCol w:w="2400"/>
+        <w:gridCol w:w="2400"/>
+        <w:gridCol w:w="1600"/>
+        <w:gridCol w:w="3000"/>
+        <w:tblGridChange w:id="0">
+          <w:tblGrid>
+            <w:gridCol w:w="2400"/>
+            <w:gridCol w:w="2400"/>
+            <w:gridCol w:w="1600"/>
+            <w:gridCol w:w="3000"/>
+          </w:tblGrid>
+        </w:tblGridChange>
+      </w:tblGrid>
+      <w:tr>
+        <w:trPr>
+          <w:cantSplit w:val="0"/>
+          <w:tblHeader w:val="1"/>
+        </w:trPr>
+        <w:tc>
+          <w:tcPr>
+            <w:shd w:fill="eeeeee" w:val="clear"/>
+          </w:tcPr>
+          <w:p>
+            <w:pPr>
+              <w:jc w:val="center"/>
+              <w:rPr/>
+            </w:pPr>
+            <w:r>
+              <w:rPr>
+                <w:b w:val="1"/>
+                <w:bCs w:val="1"/>
+                <w:rtl w:val="0"/>
+              </w:rPr>
+              <w:t xml:space="preserve">Configuration</w:t>
+            </w:r>
+            <w:r>
+              <w:rPr>
+                <w:rtl w:val="0"/>
+              </w:rPr>
+            </w:r>
+          </w:p>
+        </w:tc>
+        <w:tc>
+          <w:tcPr>
+            <w:shd w:fill="eeeeee" w:val="clear"/>
+          </w:tcPr>
+          <w:p>
+            <w:pPr>
+              <w:jc w:val="center"/>
+              <w:rPr/>
+            </w:pPr>
+            <w:r>
+              <w:rPr>
+                <w:b w:val="1"/>
+                <w:bCs w:val="1"/>
+                <w:rtl w:val="0"/>
+              </w:rPr>
+              <w:t xml:space="preserve">Main condition</w:t>
+            </w:r>
+            <w:r>
+              <w:rPr>
+                <w:rtl w:val="0"/>
+              </w:rPr>
+            </w:r>
+          </w:p>
+        </w:tc>
+        <w:tc>
+          <w:tcPr>
+            <w:shd w:fill="eeeeee" w:val="clear"/>
+          </w:tcPr>
+          <w:p>
+            <w:pPr>
+              <w:jc w:val="center"/>
+              <w:rPr/>
+            </w:pPr>
+            <w:r>
+              <w:rPr>
+                <w:b w:val="1"/>
+                <w:bCs w:val="1"/>
+                <w:rtl w:val="0"/>
+              </w:rPr>
+              <w:t xml:space="preserve">Jacobian rank</w:t>
+            </w:r>
+            <w:r>
+              <w:rPr>
+                <w:rtl w:val="0"/>
+              </w:rPr>
+            </w:r>
+          </w:p>
+        </w:tc>
+        <w:tc>
+          <w:tcPr>
+            <w:shd w:fill="eeeeee" w:val="clear"/>
+          </w:tcPr>
+          <w:p>
+            <w:pPr>
+              <w:jc w:val="center"/>
+              <w:rPr/>
+            </w:pPr>
+            <w:r>
+              <w:rPr>
+                <w:b w:val="1"/>
+                <w:bCs w:val="1"/>
+                <w:rtl w:val="0"/>
+              </w:rPr>
+              <w:t xml:space="preserve">Interpretation</w:t>
+            </w:r>
+            <w:r>
+              <w:rPr>
+                <w:rtl w:val="0"/>
+              </w:rPr>
+            </w:r>
+          </w:p>
+        </w:tc>
+      </w:tr>
+      <w:tr>
+        <w:trPr>
+          <w:cantSplit w:val="0"/>
+          <w:tblHeader w:val="0"/>
+        </w:trPr>
+        <w:tc>
+          <w:tcPr/>
+          <w:p>
+            <w:pPr>
+              <w:rPr/>
+            </w:pPr>
+            <w:r>
+              <w:rPr>
+                <w:rtl w:val="0"/>
+              </w:rPr>
+              <w:t xml:space="preserve">Generic pose</w:t>
+            </w:r>
+          </w:p>
+        </w:tc>
+        <w:tc>
+          <w:tcPr/>
+          <w:p>
+            <w:pPr>
+              <w:rPr/>
+            </w:pPr>
+            <w:r>
+              <w:rPr>
+                <w:rtl w:val="0"/>
+              </w:rPr>
+              <w:t xml:space="preserve">Bent arm</w:t>
+            </w:r>
+          </w:p>
+        </w:tc>
+        <w:tc>
+          <w:tcPr/>
+          <w:p>
+            <w:pPr>
+              <w:jc w:val="center"/>
+              <w:rPr/>
+            </w:pPr>
+            <w:r>
+              <w:rPr>
+                <w:rtl w:val="0"/>
+              </w:rPr>
+              <w:t xml:space="preserve">6</w:t>
+            </w:r>
+          </w:p>
+        </w:tc>
+        <w:tc>
+          <w:tcPr/>
+          <w:p>
+            <w:pPr>
+              <w:rPr/>
+            </w:pPr>
+            <w:r>
+              <w:rPr>
+                <w:rtl w:val="0"/>
+              </w:rPr>
+              <w:t xml:space="preserve">Full task-space mobility</w:t>
+            </w:r>
+          </w:p>
+        </w:tc>
+      </w:tr>
+      <w:tr>
+        <w:trPr>
+          <w:cantSplit w:val="0"/>
+          <w:tblHeader w:val="0"/>
+        </w:trPr>
+        <w:tc>
+          <w:tcPr/>
+          <w:p>
+            <w:pPr>
+              <w:rPr/>
+            </w:pPr>
+            <w:r>
+              <w:rPr>
+                <w:rtl w:val="0"/>
+              </w:rPr>
+              <w:t xml:space="preserve">Shoulder singularity</w:t>
+            </w:r>
+          </w:p>
+        </w:tc>
+        <w:tc>
+          <w:tcPr/>
+          <w:p>
+            <w:pPr>
+              <w:rPr/>
+            </w:pPr>
+            <w:r>
+              <w:rPr>
+                <w:rtl w:val="0"/>
+              </w:rPr>
+              <w:t xml:space="preserve">q2 = 0</w:t>
+            </w:r>
+          </w:p>
+        </w:tc>
+        <w:tc>
+          <w:tcPr/>
+          <w:p>
+            <w:pPr>
+              <w:jc w:val="center"/>
+              <w:rPr/>
+            </w:pPr>
+            <w:r>
+              <w:rPr>
+                <w:rtl w:val="0"/>
+              </w:rPr>
+              <w:t xml:space="preserve">6</w:t>
+            </w:r>
+          </w:p>
+        </w:tc>
+        <w:tc>
+          <w:tcPr/>
+          <w:p>
+            <w:pPr>
+              <w:rPr/>
+            </w:pPr>
+            <w:r>
+              <w:rPr>
+                <w:rtl w:val="0"/>
+              </w:rPr>
+              <w:t xml:space="preserve">Redundancy reduced, task motion preserved</w:t>
+            </w:r>
+          </w:p>
+        </w:tc>
+      </w:tr>
+      <w:tr>
+        <w:trPr>
+          <w:cantSplit w:val="0"/>
+          <w:tblHeader w:val="0"/>
+        </w:trPr>
+        <w:tc>
+          <w:tcPr/>
+          <w:p>
+            <w:pPr>
+              <w:rPr/>
+            </w:pPr>
+            <w:r>
+              <w:rPr>
+                <w:rtl w:val="0"/>
+              </w:rPr>
+              <w:t xml:space="preserve">Wrist singularity</w:t>
+            </w:r>
+          </w:p>
+        </w:tc>
+        <w:tc>
+          <w:tcPr/>
+          <w:p>
+            <w:pPr>
+              <w:rPr/>
+            </w:pPr>
+            <w:r>
+              <w:rPr>
+                <w:rtl w:val="0"/>
+              </w:rPr>
+              <w:t xml:space="preserve">q6 = 0</w:t>
+            </w:r>
+          </w:p>
+        </w:tc>
+        <w:tc>
+          <w:tcPr/>
+          <w:p>
+            <w:pPr>
+              <w:jc w:val="center"/>
+              <w:rPr/>
+            </w:pPr>
+            <w:r>
+              <w:rPr>
+                <w:rtl w:val="0"/>
+              </w:rPr>
+              <w:t xml:space="preserve">6</w:t>
+            </w:r>
+          </w:p>
+        </w:tc>
+        <w:tc>
+          <w:tcPr/>
+          <w:p>
+            <w:pPr>
+              <w:rPr/>
+            </w:pPr>
+            <w:r>
+              <w:rPr>
+                <w:rtl w:val="0"/>
+              </w:rPr>
+              <w:t xml:space="preserve">Redundancy reduced, task motion preserved</w:t>
+            </w:r>
+          </w:p>
+        </w:tc>
+      </w:tr>
+      <w:tr>
+        <w:trPr>
+          <w:cantSplit w:val="0"/>
+          <w:tblHeader w:val="0"/>
+        </w:trPr>
+        <w:tc>
+          <w:tcPr/>
+          <w:p>
+            <w:pPr>
+              <w:rPr/>
+            </w:pPr>
+            <w:r>
+              <w:rPr>
+                <w:rtl w:val="0"/>
+              </w:rPr>
+              <w:t xml:space="preserve">Elbow singularity</w:t>
+            </w:r>
+          </w:p>
+        </w:tc>
+        <w:tc>
+          <w:tcPr/>
+          <w:p>
+            <w:pPr>
+              <w:rPr/>
+            </w:pPr>
+            <w:r>
+              <w:rPr>
+                <w:rtl w:val="0"/>
+              </w:rPr>
+              <w:t xml:space="preserve">q4 = 0</w:t>
+            </w:r>
+          </w:p>
+        </w:tc>
+        <w:tc>
+          <w:tcPr/>
+          <w:p>
+            <w:pPr>
+              <w:jc w:val="center"/>
+              <w:rPr/>
+            </w:pPr>
+            <w:r>
+              <w:rPr>
+                <w:rtl w:val="0"/>
+              </w:rPr>
+              <w:t xml:space="preserve">5</w:t>
+            </w:r>
+          </w:p>
+        </w:tc>
+        <w:tc>
+          <w:tcPr/>
+          <w:p>
+            <w:pPr>
+              <w:rPr/>
+            </w:pPr>
+            <w:r>
+              <w:rPr>
+                <w:rtl w:val="0"/>
+              </w:rPr>
+              <w:t xml:space="preserve">One task-space direction is lost</w:t>
+            </w:r>
+          </w:p>
+        </w:tc>
+      </w:tr>
+    </w:tbl>
+    <w:p>
+      <w:pPr>
+        <w:jc w:val="left"/>
+        <w:rPr/>
+      </w:pPr>
+      <w:r>
+        <w:rPr>
+          <w:rtl w:val="0"/>
+        </w:rPr>
+      </w:r>
+    </w:p>
+    <w:p>
+      <w:pPr>
+        <w:jc w:val="left"/>
+        <w:rPr/>
+      </w:pPr>
+      <w:r>
+        <w:rPr>
+          <w:rtl w:val="0"/>
+        </w:rPr>
+        <w:t xml:space="preserve">Overall, our results show that the Jacobian model behaves as expected, correctly mapping the joint velocities into end-effector velocities, and its rank analysis identifies the elbow-stretched pose as the critical singularity for the robot arm.</w:t>
+      </w:r>
+      <w:r>
+        <w:rPr>
+          <w:rtl w:val="0"/>
+        </w:rPr>
+      </w:r>
+    </w:p>
+    <w:p>
+      <w:pPr>
+        <w:pStyle w:val="Heading2"/>
+        <w:rPr/>
+      </w:pPr>
+      <w:bookmarkStart w:colFirst="0" w:colLast="0" w:name="_tq0sx022bc7e" w:id="11"/>
+      <w:bookmarkEnd w:id="11"/>
+      <w:r>
+        <w:rPr>
+          <w:rtl w:val="0"/>
+        </w:rPr>
+        <w:t xml:space="preserve">Step 5:</w:t>
       </w:r>
     </w:p>
     <w:p>
@@ -740,16 +4217,16 @@
           <wp:inline distB="114300" distT="114300" distL="114300" distR="114300">
             <wp:extent cx="4249238" cy="314758"/>
             <wp:effectExtent b="0" l="0" r="0" t="0"/>
-            <wp:docPr id="6" name="image3.png"/>
+            <wp:docPr id="6" name="image6.png"/>
             <a:graphic>
               <a:graphicData uri="http://schemas.openxmlformats.org/drawingml/2006/picture">
                 <pic:pic>
                   <pic:nvPicPr>
-                    <pic:cNvPr id="0" name="image3.png"/>
+                    <pic:cNvPr id="0" name="image6.png"/>
                     <pic:cNvPicPr preferRelativeResize="0"/>
                   </pic:nvPicPr>
                   <pic:blipFill>
-                    <a:blip r:embed="rId6"/>
+                    <a:blip r:embed="rId9"/>
                     <a:srcRect b="0" l="0" r="0" t="0"/>
                     <a:stretch>
                       <a:fillRect/>
@@ -803,7 +4280,145 @@
           <w:szCs w:val="24"/>
           <w:rtl w:val="0"/>
         </w:rPr>
-        <w:t xml:space="preserve">In the code, the null-space gain is named “Kn”, but in the report it is written as “K_0”. The baseline value was “K_0 = 0.15 I_7”, with “q_rest = 0”, so that the robot is gently pulled toward a central resting posture without changing the final end-effector pose. In the graphic below, we can observe the convergence of the position and orientation, as the error decreases, after 1 second.</w:t>
+        <w:t xml:space="preserve">In the code, the null-space gain is named “Kn”, but in the report it is written as “K_0”. The baseline value was “K_0 = 0.15 I_7”, with “q_rest = 0”, so that the robot is gently pulled toward a central resting posture without changing the final end-effector pose. </w:t>
+      </w:r>
+    </w:p>
+    <w:p>
+      <w:pPr>
+        <w:jc w:val="left"/>
+        <w:rPr>
+          <w:sz w:val="24"/>
+          <w:szCs w:val="24"/>
+        </w:rPr>
+      </w:pPr>
+      <w:r>
+        <w:rPr>
+          <w:rtl w:val="0"/>
+        </w:rPr>
+      </w:r>
+    </w:p>
+    <w:p>
+      <w:pPr>
+        <w:jc w:val="center"/>
+        <w:rPr>
+          <w:sz w:val="24"/>
+          <w:szCs w:val="24"/>
+        </w:rPr>
+      </w:pPr>
+      <w:r>
+        <w:rPr>
+          <w:sz w:val="24"/>
+          <w:szCs w:val="24"/>
+          <w:rtl w:val="0"/>
+        </w:rPr>
+        <w:t xml:space="preserve">The final simulink model for the Closed-Loop for the Inverse Kinematics is below:</w:t>
+        <w:br w:type="textWrapping"/>
+        <w:br w:type="textWrapping"/>
+      </w:r>
+      <w:r>
+        <w:rPr>
+          <w:sz w:val="24"/>
+          <w:szCs w:val="24"/>
+        </w:rPr>
+        <w:drawing>
+          <wp:inline distB="114300" distT="114300" distL="114300" distR="114300">
+            <wp:extent cx="6135188" cy="2943225"/>
+            <wp:effectExtent b="0" l="0" r="0" t="0"/>
+            <wp:docPr id="7" name="image7.png"/>
+            <a:graphic>
+              <a:graphicData uri="http://schemas.openxmlformats.org/drawingml/2006/picture">
+                <pic:pic>
+                  <pic:nvPicPr>
+                    <pic:cNvPr id="0" name="image7.png"/>
+                    <pic:cNvPicPr preferRelativeResize="0"/>
+                  </pic:nvPicPr>
+                  <pic:blipFill>
+                    <a:blip r:embed="rId10"/>
+                    <a:srcRect b="0" l="0" r="0" t="0"/>
+                    <a:stretch>
+                      <a:fillRect/>
+                    </a:stretch>
+                  </pic:blipFill>
+                  <pic:spPr>
+                    <a:xfrm>
+                      <a:off x="0" y="0"/>
+                      <a:ext cx="6135188" cy="2943225"/>
+                    </a:xfrm>
+                    <a:prstGeom prst="rect"/>
+                    <a:ln/>
+                  </pic:spPr>
+                </pic:pic>
+              </a:graphicData>
+            </a:graphic>
+          </wp:inline>
+        </w:drawing>
+      </w:r>
+      <w:r>
+        <w:rPr>
+          <w:rtl w:val="0"/>
+        </w:rPr>
+      </w:r>
+    </w:p>
+    <w:p>
+      <w:pPr>
+        <w:jc w:val="left"/>
+        <w:rPr>
+          <w:sz w:val="24"/>
+          <w:szCs w:val="24"/>
+        </w:rPr>
+      </w:pPr>
+      <w:r>
+        <w:rPr>
+          <w:rtl w:val="0"/>
+        </w:rPr>
+      </w:r>
+    </w:p>
+    <w:p>
+      <w:pPr>
+        <w:jc w:val="left"/>
+        <w:rPr>
+          <w:sz w:val="24"/>
+          <w:szCs w:val="24"/>
+        </w:rPr>
+      </w:pPr>
+      <w:r>
+        <w:rPr>
+          <w:sz w:val="24"/>
+          <w:szCs w:val="24"/>
+          <w:rtl w:val="0"/>
+        </w:rPr>
+        <w:t xml:space="preserve">In the model, the desired position, orientation, and task-space velocities are provided as inputs to the CLIK controller block. Using the current joint configuration, the controller computes the forward kinematics and the geometric Jacobian of the manipulator, evaluates the errors, and generates the joint velocity vector q· .  The joint velocities are integrated to obtain the updated joint positions q, which are then fed back into the controller, closing the feedback loop. Additional inputs allow tuning of the proportional gain, null-space stabilization gain, damping factor, and pseudoinverse method which were also tested with different values.</w:t>
+      </w:r>
+    </w:p>
+    <w:p>
+      <w:pPr>
+        <w:jc w:val="left"/>
+        <w:rPr>
+          <w:sz w:val="24"/>
+          <w:szCs w:val="24"/>
+        </w:rPr>
+      </w:pPr>
+      <w:r>
+        <w:rPr>
+          <w:rtl w:val="0"/>
+        </w:rPr>
+      </w:r>
+    </w:p>
+    <w:p>
+      <w:pPr>
+        <w:jc w:val="left"/>
+        <w:rPr>
+          <w:sz w:val="24"/>
+          <w:szCs w:val="24"/>
+        </w:rPr>
+      </w:pPr>
+      <w:r>
+        <w:rPr>
+          <w:sz w:val="24"/>
+          <w:szCs w:val="24"/>
+          <w:rtl w:val="0"/>
+        </w:rPr>
+        <w:t xml:space="preserve">In the graphic below, we can observe the convergence of the position and orientation, as the error decreases to almost 0, after 1 second.</w:t>
       </w:r>
     </w:p>
     <w:p>
@@ -838,16 +4453,16 @@
           <wp:inline distB="114300" distT="114300" distL="114300" distR="114300">
             <wp:extent cx="5760000" cy="3683000"/>
             <wp:effectExtent b="0" l="0" r="0" t="0"/>
-            <wp:docPr id="2" name="image6.png"/>
+            <wp:docPr id="10" name="image14.png"/>
             <a:graphic>
               <a:graphicData uri="http://schemas.openxmlformats.org/drawingml/2006/picture">
                 <pic:pic>
                   <pic:nvPicPr>
-                    <pic:cNvPr id="0" name="image6.png"/>
+                    <pic:cNvPr id="0" name="image14.png"/>
                     <pic:cNvPicPr preferRelativeResize="0"/>
                   </pic:nvPicPr>
                   <pic:blipFill>
-                    <a:blip r:embed="rId7"/>
+                    <a:blip r:embed="rId11"/>
                     <a:srcRect b="0" l="0" r="0" t="0"/>
                     <a:stretch>
                       <a:fillRect/>
@@ -950,7 +4565,7 @@
           <w:szCs w:val="24"/>
           <w:rtl w:val="0"/>
         </w:rPr>
-        <w:t xml:space="preserve">First, a target pose was generated from a known joint configuration and the the desired pose ‘(p_d, R_d)’ was obtained through forward kinematics and then tested with the analytical inverse kinematics model from Step 3. The resulting error was practically zero:</w:t>
+        <w:t xml:space="preserve">First, a target pose was generated from a known joint configuration and the desired pose ‘(p_d, R_d)’ was obtained through forward kinematics and then tested with the analytical inverse kinematics model from Step 3. The resulting error was practically zero:</w:t>
       </w:r>
     </w:p>
     <w:p>
@@ -979,7 +4594,7 @@
     </w:p>
     <w:tbl>
       <w:tblPr>
-        <w:tblStyle w:val="Table1"/>
+        <w:tblStyle w:val="Table5"/>
         <w:tblW w:w="9000.0" w:type="dxa"/>
         <w:jc w:val="left"/>
         <w:tblBorders>
@@ -1137,7 +4752,13 @@
               <w:rPr>
                 <w:rtl w:val="0"/>
               </w:rPr>
-              <w:t xml:space="preserve">CLIK, baseline case</w:t>
+              <w:t xml:space="preserve">CLIK</w:t>
+            </w:r>
+            <w:r>
+              <w:rPr>
+                <w:rtl w:val="0"/>
+              </w:rPr>
+              <w:t xml:space="preserve">, baseline case</w:t>
             </w:r>
           </w:p>
         </w:tc>
@@ -1247,16 +4868,16 @@
           <wp:inline distB="114300" distT="114300" distL="114300" distR="114300">
             <wp:extent cx="4925513" cy="330571"/>
             <wp:effectExtent b="0" l="0" r="0" t="0"/>
-            <wp:docPr id="4" name="image2.png"/>
+            <wp:docPr id="2" name="image10.png"/>
             <a:graphic>
               <a:graphicData uri="http://schemas.openxmlformats.org/drawingml/2006/picture">
                 <pic:pic>
                   <pic:nvPicPr>
-                    <pic:cNvPr id="0" name="image2.png"/>
+                    <pic:cNvPr id="0" name="image10.png"/>
                     <pic:cNvPicPr preferRelativeResize="0"/>
                   </pic:nvPicPr>
                   <pic:blipFill>
-                    <a:blip r:embed="rId8"/>
+                    <a:blip r:embed="rId12"/>
                     <a:srcRect b="0" l="0" r="0" t="0"/>
                     <a:stretch>
                       <a:fillRect/>
@@ -1306,182 +4927,144 @@
       </w:pPr>
       <w:r>
         <w:rPr>
+          <w:rtl w:val="0"/>
+        </w:rPr>
+      </w:r>
+    </w:p>
+    <w:p>
+      <w:pPr>
+        <w:jc w:val="center"/>
+        <w:rPr>
+          <w:sz w:val="24"/>
+          <w:szCs w:val="24"/>
+        </w:rPr>
+      </w:pPr>
+      <w:r>
+        <w:rPr>
+          <w:rtl w:val="0"/>
+        </w:rPr>
+      </w:r>
+    </w:p>
+    <w:p>
+      <w:pPr>
+        <w:jc w:val="center"/>
+        <w:rPr>
+          <w:sz w:val="24"/>
+          <w:szCs w:val="24"/>
+        </w:rPr>
+      </w:pPr>
+      <w:r>
+        <w:rPr>
+          <w:rtl w:val="0"/>
+        </w:rPr>
+      </w:r>
+    </w:p>
+    <w:p>
+      <w:pPr>
+        <w:jc w:val="left"/>
+        <w:rPr>
+          <w:b w:val="1"/>
+          <w:bCs w:val="1"/>
+          <w:sz w:val="24"/>
+          <w:szCs w:val="24"/>
+        </w:rPr>
+      </w:pPr>
+      <w:r>
+        <w:rPr>
+          <w:b w:val="1"/>
+          <w:bCs w:val="1"/>
+          <w:sz w:val="24"/>
+          <w:szCs w:val="24"/>
+          <w:rtl w:val="0"/>
+        </w:rPr>
+        <w:t xml:space="preserve">5.2 Influence of the Proportional Gain</w:t>
+      </w:r>
+    </w:p>
+    <w:p>
+      <w:pPr>
+        <w:jc w:val="left"/>
+        <w:rPr>
+          <w:sz w:val="24"/>
+          <w:szCs w:val="24"/>
+        </w:rPr>
+      </w:pPr>
+      <w:r>
+        <w:rPr>
+          <w:rtl w:val="0"/>
+        </w:rPr>
+      </w:r>
+    </w:p>
+    <w:p>
+      <w:pPr>
+        <w:jc w:val="left"/>
+        <w:rPr>
+          <w:sz w:val="24"/>
+          <w:szCs w:val="24"/>
+        </w:rPr>
+      </w:pPr>
+      <w:r>
+        <w:rPr>
+          <w:sz w:val="24"/>
+          <w:szCs w:val="24"/>
+          <w:rtl w:val="0"/>
+        </w:rPr>
+        <w:t xml:space="preserve">Three proportional gain values were tested while keeping the same target, the same initial configuration, and ‘K_0 = 0.15’. The purpose was to observe how the gain affects convergence speed, stability, and joint effort.</w:t>
+      </w:r>
+    </w:p>
+    <w:p>
+      <w:pPr>
+        <w:jc w:val="center"/>
+        <w:rPr>
+          <w:sz w:val="24"/>
+          <w:szCs w:val="24"/>
+        </w:rPr>
+      </w:pPr>
+      <w:r>
+        <w:rPr>
+          <w:rtl w:val="0"/>
+        </w:rPr>
+      </w:r>
+    </w:p>
+    <w:p>
+      <w:pPr>
+        <w:jc w:val="center"/>
+        <w:rPr>
+          <w:sz w:val="24"/>
+          <w:szCs w:val="24"/>
+        </w:rPr>
+      </w:pPr>
+      <w:r>
+        <w:rPr>
+          <w:rtl w:val="0"/>
+        </w:rPr>
+      </w:r>
+    </w:p>
+    <w:p>
+      <w:pPr>
+        <w:rPr>
+          <w:sz w:val="24"/>
+          <w:szCs w:val="24"/>
+        </w:rPr>
+      </w:pPr>
+      <w:r>
+        <w:rPr>
           <w:sz w:val="24"/>
           <w:szCs w:val="24"/>
         </w:rPr>
         <w:drawing>
           <wp:inline distB="114300" distT="114300" distL="114300" distR="114300">
-            <wp:extent cx="4935038" cy="331211"/>
+            <wp:extent cx="5535113" cy="3647096"/>
             <wp:effectExtent b="0" l="0" r="0" t="0"/>
-            <wp:docPr id="1" name="image1.png"/>
+            <wp:docPr id="5" name="image8.png"/>
             <a:graphic>
               <a:graphicData uri="http://schemas.openxmlformats.org/drawingml/2006/picture">
                 <pic:pic>
                   <pic:nvPicPr>
-                    <pic:cNvPr id="0" name="image1.png"/>
+                    <pic:cNvPr id="0" name="image8.png"/>
                     <pic:cNvPicPr preferRelativeResize="0"/>
                   </pic:nvPicPr>
                   <pic:blipFill>
-                    <a:blip r:embed="rId8"/>
-                    <a:srcRect b="0" l="0" r="0" t="0"/>
-                    <a:stretch>
-                      <a:fillRect/>
-                    </a:stretch>
-                  </pic:blipFill>
-                  <pic:spPr>
-                    <a:xfrm>
-                      <a:off x="0" y="0"/>
-                      <a:ext cx="4935038" cy="331211"/>
-                    </a:xfrm>
-                    <a:prstGeom prst="rect"/>
-                    <a:ln/>
-                  </pic:spPr>
-                </pic:pic>
-              </a:graphicData>
-            </a:graphic>
-          </wp:inline>
-        </w:drawing>
-      </w:r>
-      <w:r>
-        <w:rPr>
-          <w:rtl w:val="0"/>
-        </w:rPr>
-      </w:r>
-    </w:p>
-    <w:p>
-      <w:pPr>
-        <w:jc w:val="center"/>
-        <w:rPr>
-          <w:sz w:val="24"/>
-          <w:szCs w:val="24"/>
-        </w:rPr>
-      </w:pPr>
-      <w:r>
-        <w:rPr>
-          <w:rtl w:val="0"/>
-        </w:rPr>
-      </w:r>
-    </w:p>
-    <w:p>
-      <w:pPr>
-        <w:jc w:val="center"/>
-        <w:rPr>
-          <w:sz w:val="24"/>
-          <w:szCs w:val="24"/>
-        </w:rPr>
-      </w:pPr>
-      <w:r>
-        <w:rPr>
-          <w:rtl w:val="0"/>
-        </w:rPr>
-      </w:r>
-    </w:p>
-    <w:p>
-      <w:pPr>
-        <w:jc w:val="left"/>
-        <w:rPr>
-          <w:b w:val="1"/>
-          <w:bCs w:val="1"/>
-          <w:sz w:val="24"/>
-          <w:szCs w:val="24"/>
-        </w:rPr>
-      </w:pPr>
-      <w:r>
-        <w:rPr>
-          <w:b w:val="1"/>
-          <w:bCs w:val="1"/>
-          <w:sz w:val="24"/>
-          <w:szCs w:val="24"/>
-          <w:rtl w:val="0"/>
-        </w:rPr>
-        <w:t xml:space="preserve">5.2 Influence of the Proportional Gain</w:t>
-      </w:r>
-    </w:p>
-    <w:p>
-      <w:pPr>
-        <w:jc w:val="left"/>
-        <w:rPr>
-          <w:sz w:val="24"/>
-          <w:szCs w:val="24"/>
-        </w:rPr>
-      </w:pPr>
-      <w:r>
-        <w:rPr>
-          <w:rtl w:val="0"/>
-        </w:rPr>
-      </w:r>
-    </w:p>
-    <w:p>
-      <w:pPr>
-        <w:jc w:val="left"/>
-        <w:rPr>
-          <w:sz w:val="24"/>
-          <w:szCs w:val="24"/>
-        </w:rPr>
-      </w:pPr>
-      <w:r>
-        <w:rPr>
-          <w:sz w:val="24"/>
-          <w:szCs w:val="24"/>
-          <w:rtl w:val="0"/>
-        </w:rPr>
-        <w:t xml:space="preserve">Three proportional gain values were tested while keeping the same target, the same initial configuration, and ‘K_0 = 0.15’. The purpose was to observe how the gain affects convergence speed, stability, and joint effort.</w:t>
-      </w:r>
-    </w:p>
-    <w:p>
-      <w:pPr>
-        <w:jc w:val="center"/>
-        <w:rPr>
-          <w:sz w:val="24"/>
-          <w:szCs w:val="24"/>
-        </w:rPr>
-      </w:pPr>
-      <w:r>
-        <w:rPr>
-          <w:rtl w:val="0"/>
-        </w:rPr>
-      </w:r>
-    </w:p>
-    <w:p>
-      <w:pPr>
-        <w:jc w:val="center"/>
-        <w:rPr>
-          <w:sz w:val="24"/>
-          <w:szCs w:val="24"/>
-        </w:rPr>
-      </w:pPr>
-      <w:r>
-        <w:rPr>
-          <w:rtl w:val="0"/>
-        </w:rPr>
-      </w:r>
-    </w:p>
-    <w:p>
-      <w:pPr>
-        <w:rPr>
-          <w:sz w:val="24"/>
-          <w:szCs w:val="24"/>
-        </w:rPr>
-      </w:pPr>
-      <w:r>
-        <w:rPr>
-          <w:sz w:val="24"/>
-          <w:szCs w:val="24"/>
-        </w:rPr>
-        <w:drawing>
-          <wp:inline distB="114300" distT="114300" distL="114300" distR="114300">
-            <wp:extent cx="5535113" cy="3647096"/>
-            <wp:effectExtent b="0" l="0" r="0" t="0"/>
-            <wp:docPr id="5" name="image5.png"/>
-            <a:graphic>
-              <a:graphicData uri="http://schemas.openxmlformats.org/drawingml/2006/picture">
-                <pic:pic>
-                  <pic:nvPicPr>
-                    <pic:cNvPr id="0" name="image5.png"/>
-                    <pic:cNvPicPr preferRelativeResize="0"/>
-                  </pic:nvPicPr>
-                  <pic:blipFill>
-                    <a:blip r:embed="rId9"/>
+                    <a:blip r:embed="rId13"/>
                     <a:srcRect b="0" l="0" r="0" t="0"/>
                     <a:stretch>
                       <a:fillRect/>
@@ -1605,16 +5188,16 @@
           <wp:inline distB="114300" distT="114300" distL="114300" distR="114300">
             <wp:extent cx="5344613" cy="351501"/>
             <wp:effectExtent b="0" l="0" r="0" t="0"/>
-            <wp:docPr id="7" name="image7.png"/>
+            <wp:docPr id="8" name="image3.png"/>
             <a:graphic>
               <a:graphicData uri="http://schemas.openxmlformats.org/drawingml/2006/picture">
                 <pic:pic>
                   <pic:nvPicPr>
-                    <pic:cNvPr id="0" name="image7.png"/>
+                    <pic:cNvPr id="0" name="image3.png"/>
                     <pic:cNvPicPr preferRelativeResize="0"/>
                   </pic:nvPicPr>
                   <pic:blipFill>
-                    <a:blip r:embed="rId10"/>
+                    <a:blip r:embed="rId14"/>
                     <a:srcRect b="0" l="0" r="0" t="0"/>
                     <a:stretch>
                       <a:fillRect/>
@@ -1665,7 +5248,7 @@
     </w:p>
     <w:tbl>
       <w:tblPr>
-        <w:tblStyle w:val="Table2"/>
+        <w:tblStyle w:val="Table6"/>
         <w:tblW w:w="10000.0" w:type="dxa"/>
         <w:jc w:val="left"/>
         <w:tblBorders>
@@ -1733,7 +5316,23 @@
                 <w:bCs w:val="1"/>
                 <w:rtl w:val="0"/>
               </w:rPr>
-              <w:t xml:space="preserve">Final pos. error (mm)</w:t>
+              <w:t xml:space="preserve">Final </w:t>
+            </w:r>
+            <w:r>
+              <w:rPr>
+                <w:b w:val="1"/>
+                <w:bCs w:val="1"/>
+                <w:rtl w:val="0"/>
+              </w:rPr>
+              <w:t xml:space="preserve">pos</w:t>
+            </w:r>
+            <w:r>
+              <w:rPr>
+                <w:b w:val="1"/>
+                <w:bCs w:val="1"/>
+                <w:rtl w:val="0"/>
+              </w:rPr>
+              <w:t xml:space="preserve">. error (mm)</w:t>
             </w:r>
             <w:r>
               <w:rPr>
@@ -1821,7 +5420,18 @@
               <w:rPr>
                 <w:rtl w:val="0"/>
               </w:rPr>
-              <w:t xml:space="preserve">Baseline q_0</w:t>
+              <w:t xml:space="preserve">Baseline </w:t>
+            </w:r>
+            <w:r>
+              <w:rPr>
+                <w:rtl w:val="0"/>
+              </w:rPr>
+              <w:t xml:space="preserve">q_0</w:t>
+            </w:r>
+            <w:r>
+              <w:rPr>
+                <w:rtl w:val="0"/>
+              </w:rPr>
             </w:r>
           </w:p>
         </w:tc>
@@ -1897,7 +5507,18 @@
               <w:rPr>
                 <w:rtl w:val="0"/>
               </w:rPr>
-              <w:t xml:space="preserve">Different q_0</w:t>
+              <w:t xml:space="preserve">Different </w:t>
+            </w:r>
+            <w:r>
+              <w:rPr>
+                <w:rtl w:val="0"/>
+              </w:rPr>
+              <w:t xml:space="preserve">q_0</w:t>
+            </w:r>
+            <w:r>
+              <w:rPr>
+                <w:rtl w:val="0"/>
+              </w:rPr>
             </w:r>
           </w:p>
         </w:tc>
@@ -2094,16 +5715,16 @@
           <wp:inline distB="114300" distT="114300" distL="114300" distR="114300">
             <wp:extent cx="5760000" cy="3810000"/>
             <wp:effectExtent b="0" l="0" r="0" t="0"/>
-            <wp:docPr id="3" name="image4.png"/>
+            <wp:docPr id="11" name="image13.png"/>
             <a:graphic>
               <a:graphicData uri="http://schemas.openxmlformats.org/drawingml/2006/picture">
                 <pic:pic>
                   <pic:nvPicPr>
-                    <pic:cNvPr id="0" name="image4.png"/>
+                    <pic:cNvPr id="0" name="image13.png"/>
                     <pic:cNvPicPr preferRelativeResize="0"/>
                   </pic:nvPicPr>
                   <pic:blipFill>
-                    <a:blip r:embed="rId11"/>
+                    <a:blip r:embed="rId15"/>
                     <a:srcRect b="0" l="0" r="0" t="0"/>
                     <a:stretch>
                       <a:fillRect/>
@@ -2144,7 +5765,7 @@
     </w:p>
     <w:tbl>
       <w:tblPr>
-        <w:tblStyle w:val="Table3"/>
+        <w:tblStyle w:val="Table7"/>
         <w:tblW w:w="9630.0" w:type="dxa"/>
         <w:jc w:val="left"/>
         <w:tblInd w:w="-285.0" w:type="dxa"/>
@@ -2318,7 +5939,27 @@
                 <w:szCs w:val="24"/>
                 <w:rtl w:val="0"/>
               </w:rPr>
-              <w:t xml:space="preserve">Final pos. error (mm)</w:t>
+              <w:t xml:space="preserve">Final </w:t>
+            </w:r>
+            <w:r>
+              <w:rPr>
+                <w:b w:val="1"/>
+                <w:bCs w:val="1"/>
+                <w:sz w:val="24"/>
+                <w:szCs w:val="24"/>
+                <w:rtl w:val="0"/>
+              </w:rPr>
+              <w:t xml:space="preserve">pos</w:t>
+            </w:r>
+            <w:r>
+              <w:rPr>
+                <w:b w:val="1"/>
+                <w:bCs w:val="1"/>
+                <w:sz w:val="24"/>
+                <w:szCs w:val="24"/>
+                <w:rtl w:val="0"/>
+              </w:rPr>
+              <w:t xml:space="preserve">. error (mm)</w:t>
             </w:r>
           </w:p>
         </w:tc>
@@ -3233,24 +6874,301 @@
     </w:p>
     <w:p>
       <w:pPr>
-        <w:rPr>
-          <w:sz w:val="24"/>
-          <w:szCs w:val="24"/>
-        </w:rPr>
-      </w:pPr>
-      <w:r>
-        <w:rPr>
-          <w:rtl w:val="0"/>
-        </w:rPr>
-      </w:r>
-    </w:p>
-    <w:p>
-      <w:pPr>
-        <w:rPr>
-          <w:sz w:val="24"/>
-          <w:szCs w:val="24"/>
-        </w:rPr>
-      </w:pPr>
+        <w:pStyle w:val="Title"/>
+        <w:rPr/>
+      </w:pPr>
+      <w:bookmarkStart w:colFirst="0" w:colLast="0" w:name="_h7w7je4a51d8" w:id="12"/>
+      <w:bookmarkEnd w:id="12"/>
+      <w:r>
+        <w:rPr>
+          <w:rtl w:val="0"/>
+        </w:rPr>
+        <w:t xml:space="preserve">Annex A:</w:t>
+      </w:r>
+    </w:p>
+    <w:p>
+      <w:pPr>
+        <w:pStyle w:val="Subtitle"/>
+        <w:rPr/>
+      </w:pPr>
+      <w:bookmarkStart w:colFirst="0" w:colLast="0" w:name="_93l0f763nt1z" w:id="13"/>
+      <w:bookmarkEnd w:id="13"/>
+      <w:r>
+        <w:rPr>
+          <w:rtl w:val="0"/>
+        </w:rPr>
+        <w:t xml:space="preserve">Test Cases for Direct kinematics:</w:t>
+      </w:r>
+    </w:p>
+    <w:p>
+      <w:pPr>
+        <w:jc w:val="center"/>
+        <w:rPr/>
+      </w:pPr>
+      <w:r>
+        <w:rPr/>
+        <w:drawing>
+          <wp:inline distB="114300" distT="114300" distL="114300" distR="114300">
+            <wp:extent cx="5760000" cy="4495800"/>
+            <wp:effectExtent b="0" l="0" r="0" t="0"/>
+            <wp:docPr id="1" name="image12.png"/>
+            <a:graphic>
+              <a:graphicData uri="http://schemas.openxmlformats.org/drawingml/2006/picture">
+                <pic:pic>
+                  <pic:nvPicPr>
+                    <pic:cNvPr id="0" name="image12.png"/>
+                    <pic:cNvPicPr preferRelativeResize="0"/>
+                  </pic:nvPicPr>
+                  <pic:blipFill>
+                    <a:blip r:embed="rId16"/>
+                    <a:srcRect b="0" l="0" r="0" t="0"/>
+                    <a:stretch>
+                      <a:fillRect/>
+                    </a:stretch>
+                  </pic:blipFill>
+                  <pic:spPr>
+                    <a:xfrm>
+                      <a:off x="0" y="0"/>
+                      <a:ext cx="5760000" cy="4495800"/>
+                    </a:xfrm>
+                    <a:prstGeom prst="rect"/>
+                    <a:ln/>
+                  </pic:spPr>
+                </pic:pic>
+              </a:graphicData>
+            </a:graphic>
+          </wp:inline>
+        </w:drawing>
+      </w:r>
+      <w:r>
+        <w:rPr>
+          <w:rtl w:val="0"/>
+        </w:rPr>
+      </w:r>
+    </w:p>
+    <w:p>
+      <w:pPr>
+        <w:jc w:val="center"/>
+        <w:rPr/>
+      </w:pPr>
+      <w:r>
+        <w:rPr>
+          <w:i w:val="1"/>
+          <w:iCs w:val="1"/>
+          <w:rtl w:val="0"/>
+        </w:rPr>
+        <w:t xml:space="preserve">Figure A.1: Home (Fully stretched)</w:t>
+      </w:r>
+      <w:r>
+        <w:rPr>
+          <w:rtl w:val="0"/>
+        </w:rPr>
+      </w:r>
+    </w:p>
+    <w:p>
+      <w:pPr>
+        <w:jc w:val="center"/>
+        <w:rPr/>
+      </w:pPr>
+      <w:r>
+        <w:rPr/>
+        <w:drawing>
+          <wp:inline distB="114300" distT="114300" distL="114300" distR="114300">
+            <wp:extent cx="5760000" cy="4495800"/>
+            <wp:effectExtent b="0" l="0" r="0" t="0"/>
+            <wp:docPr id="4" name="image1.png"/>
+            <a:graphic>
+              <a:graphicData uri="http://schemas.openxmlformats.org/drawingml/2006/picture">
+                <pic:pic>
+                  <pic:nvPicPr>
+                    <pic:cNvPr id="0" name="image1.png"/>
+                    <pic:cNvPicPr preferRelativeResize="0"/>
+                  </pic:nvPicPr>
+                  <pic:blipFill>
+                    <a:blip r:embed="rId17"/>
+                    <a:srcRect b="0" l="0" r="0" t="0"/>
+                    <a:stretch>
+                      <a:fillRect/>
+                    </a:stretch>
+                  </pic:blipFill>
+                  <pic:spPr>
+                    <a:xfrm>
+                      <a:off x="0" y="0"/>
+                      <a:ext cx="5760000" cy="4495800"/>
+                    </a:xfrm>
+                    <a:prstGeom prst="rect"/>
+                    <a:ln/>
+                  </pic:spPr>
+                </pic:pic>
+              </a:graphicData>
+            </a:graphic>
+          </wp:inline>
+        </w:drawing>
+      </w:r>
+      <w:r>
+        <w:rPr>
+          <w:rtl w:val="0"/>
+        </w:rPr>
+      </w:r>
+    </w:p>
+    <w:p>
+      <w:pPr>
+        <w:jc w:val="center"/>
+        <w:rPr/>
+      </w:pPr>
+      <w:r>
+        <w:rPr>
+          <w:i w:val="1"/>
+          <w:iCs w:val="1"/>
+          <w:rtl w:val="0"/>
+        </w:rPr>
+        <w:t xml:space="preserve">Figure A.2: Shoulder Bend</w:t>
+      </w:r>
+      <w:r>
+        <w:rPr>
+          <w:rtl w:val="0"/>
+        </w:rPr>
+      </w:r>
+    </w:p>
+    <w:p>
+      <w:pPr>
+        <w:jc w:val="center"/>
+        <w:rPr/>
+      </w:pPr>
+      <w:r>
+        <w:rPr/>
+        <w:drawing>
+          <wp:inline distB="114300" distT="114300" distL="114300" distR="114300">
+            <wp:extent cx="5760000" cy="4495800"/>
+            <wp:effectExtent b="0" l="0" r="0" t="0"/>
+            <wp:docPr id="3" name="image2.png"/>
+            <a:graphic>
+              <a:graphicData uri="http://schemas.openxmlformats.org/drawingml/2006/picture">
+                <pic:pic>
+                  <pic:nvPicPr>
+                    <pic:cNvPr id="0" name="image2.png"/>
+                    <pic:cNvPicPr preferRelativeResize="0"/>
+                  </pic:nvPicPr>
+                  <pic:blipFill>
+                    <a:blip r:embed="rId18"/>
+                    <a:srcRect b="0" l="0" r="0" t="0"/>
+                    <a:stretch>
+                      <a:fillRect/>
+                    </a:stretch>
+                  </pic:blipFill>
+                  <pic:spPr>
+                    <a:xfrm>
+                      <a:off x="0" y="0"/>
+                      <a:ext cx="5760000" cy="4495800"/>
+                    </a:xfrm>
+                    <a:prstGeom prst="rect"/>
+                    <a:ln/>
+                  </pic:spPr>
+                </pic:pic>
+              </a:graphicData>
+            </a:graphic>
+          </wp:inline>
+        </w:drawing>
+      </w:r>
+      <w:r>
+        <w:rPr>
+          <w:rtl w:val="0"/>
+        </w:rPr>
+      </w:r>
+    </w:p>
+    <w:p>
+      <w:pPr>
+        <w:jc w:val="center"/>
+        <w:rPr/>
+      </w:pPr>
+      <w:r>
+        <w:rPr>
+          <w:i w:val="1"/>
+          <w:iCs w:val="1"/>
+          <w:rtl w:val="0"/>
+        </w:rPr>
+        <w:t xml:space="preserve">Figure A.3: L-Shape Bend</w:t>
+      </w:r>
+      <w:r>
+        <w:rPr>
+          <w:rtl w:val="0"/>
+        </w:rPr>
+      </w:r>
+    </w:p>
+    <w:p>
+      <w:pPr>
+        <w:pStyle w:val="Subtitle"/>
+        <w:rPr/>
+      </w:pPr>
+      <w:bookmarkStart w:colFirst="0" w:colLast="0" w:name="_wp9wgxbof5ej" w:id="14"/>
+      <w:bookmarkEnd w:id="14"/>
+      <w:r>
+        <w:rPr/>
+        <w:drawing>
+          <wp:inline distB="114300" distT="114300" distL="114300" distR="114300">
+            <wp:extent cx="5760000" cy="4495800"/>
+            <wp:effectExtent b="0" l="0" r="0" t="0"/>
+            <wp:docPr id="12" name="image4.png"/>
+            <a:graphic>
+              <a:graphicData uri="http://schemas.openxmlformats.org/drawingml/2006/picture">
+                <pic:pic>
+                  <pic:nvPicPr>
+                    <pic:cNvPr id="0" name="image4.png"/>
+                    <pic:cNvPicPr preferRelativeResize="0"/>
+                  </pic:nvPicPr>
+                  <pic:blipFill>
+                    <a:blip r:embed="rId19"/>
+                    <a:srcRect b="0" l="0" r="0" t="0"/>
+                    <a:stretch>
+                      <a:fillRect/>
+                    </a:stretch>
+                  </pic:blipFill>
+                  <pic:spPr>
+                    <a:xfrm>
+                      <a:off x="0" y="0"/>
+                      <a:ext cx="5760000" cy="4495800"/>
+                    </a:xfrm>
+                    <a:prstGeom prst="rect"/>
+                    <a:ln/>
+                  </pic:spPr>
+                </pic:pic>
+              </a:graphicData>
+            </a:graphic>
+          </wp:inline>
+        </w:drawing>
+      </w:r>
+      <w:r>
+        <w:rPr>
+          <w:rtl w:val="0"/>
+        </w:rPr>
+      </w:r>
+    </w:p>
+    <w:p>
+      <w:pPr>
+        <w:jc w:val="center"/>
+        <w:rPr/>
+      </w:pPr>
+      <w:r>
+        <w:rPr>
+          <w:i w:val="1"/>
+          <w:iCs w:val="1"/>
+          <w:rtl w:val="0"/>
+        </w:rPr>
+        <w:t xml:space="preserve">Figure A.4: Inverse Kinematics Elbow Bend</w:t>
+      </w:r>
+      <w:r>
+        <w:rPr>
+          <w:rtl w:val="0"/>
+        </w:rPr>
+      </w:r>
+    </w:p>
+    <w:p>
+      <w:pPr>
+        <w:pStyle w:val="Subtitle"/>
+        <w:rPr/>
+      </w:pPr>
+      <w:bookmarkStart w:colFirst="0" w:colLast="0" w:name="_93l0f763nt1z" w:id="13"/>
+      <w:bookmarkEnd w:id="13"/>
       <w:r>
         <w:rPr>
           <w:rtl w:val="0"/>
@@ -3258,12 +7176,61 @@
       </w:r>
     </w:p>
     <w:sectPr>
+      <w:headerReference r:id="rId20" w:type="default"/>
+      <w:headerReference r:id="rId21" w:type="first"/>
+      <w:footerReference r:id="rId22" w:type="first"/>
       <w:pgSz w:h="16838" w:w="11906" w:orient="portrait"/>
-      <w:pgMar w:bottom="1133.8582677165355" w:top="1700.7874015748032" w:left="1700.7874015748032" w:right="1133.8582677165355" w:header="720" w:footer="720"/>
+      <w:pgMar w:bottom="1133.8582677165355" w:top="1700.7874015748032" w:left="1700.7874015748032" w:right="1133.8582677165355" w:header="0" w:footer="0"/>
       <w:pgNumType w:start="1"/>
+      <w:titlePg w:val="1"/>
     </w:sectPr>
   </w:body>
 </w:document>
+</file>
+
+<file path=word/footer1.xml><?xml version="1.0" encoding="utf-8"?>
+<w:ftr xmlns:mc="http://schemas.openxmlformats.org/markup-compatibility/2006" xmlns:o="urn:schemas-microsoft-com:office:office" xmlns:r="http://schemas.openxmlformats.org/officeDocument/2006/relationships" xmlns:m="http://schemas.openxmlformats.org/officeDocument/2006/math" xmlns:v="urn:schemas-microsoft-com:vml" xmlns:wp="http://schemas.openxmlformats.org/drawingml/2006/wordprocessingDrawing" xmlns:w10="urn:schemas-microsoft-com:office:word" xmlns:w="http://schemas.openxmlformats.org/wordprocessingml/2006/main" xmlns:wne="http://schemas.microsoft.com/office/word/2006/wordml" xmlns:sl="http://schemas.openxmlformats.org/schemaLibrary/2006/main" xmlns:a="http://schemas.openxmlformats.org/drawingml/2006/main" xmlns:pic="http://schemas.openxmlformats.org/drawingml/2006/picture" xmlns:c="http://schemas.openxmlformats.org/drawingml/2006/chart" xmlns:lc="http://schemas.openxmlformats.org/drawingml/2006/lockedCanvas" xmlns:dgm="http://schemas.openxmlformats.org/drawingml/2006/diagram" xmlns:wps="http://schemas.microsoft.com/office/word/2010/wordprocessingShape" xmlns:wpg="http://schemas.microsoft.com/office/word/2010/wordprocessingGroup" xmlns:w14="http://schemas.microsoft.com/office/word/2010/wordml" xmlns:w15="http://schemas.microsoft.com/office/word/2012/wordml" xmlns:w16="http://schemas.microsoft.com/office/word/2018/wordml" xmlns:w16cex="http://schemas.microsoft.com/office/word/2018/wordml/cex" xmlns:w16cid="http://schemas.microsoft.com/office/word/2016/wordml/cid" xmlns="http://schemas.microsoft.com/office/tasks/2019/documenttasks" xmlns:cr="http://schemas.microsoft.com/office/comments/2020/reactions">
+  <w:p>
+    <w:pPr>
+      <w:rPr/>
+    </w:pPr>
+    <w:r>
+      <w:rPr>
+        <w:rtl w:val="0"/>
+      </w:rPr>
+    </w:r>
+  </w:p>
+</w:ftr>
+</file>
+
+<file path=word/header1.xml><?xml version="1.0" encoding="utf-8"?>
+<w:hdr xmlns:mc="http://schemas.openxmlformats.org/markup-compatibility/2006" xmlns:o="urn:schemas-microsoft-com:office:office" xmlns:r="http://schemas.openxmlformats.org/officeDocument/2006/relationships" xmlns:m="http://schemas.openxmlformats.org/officeDocument/2006/math" xmlns:v="urn:schemas-microsoft-com:vml" xmlns:wp="http://schemas.openxmlformats.org/drawingml/2006/wordprocessingDrawing" xmlns:w10="urn:schemas-microsoft-com:office:word" xmlns:w="http://schemas.openxmlformats.org/wordprocessingml/2006/main" xmlns:wne="http://schemas.microsoft.com/office/word/2006/wordml" xmlns:sl="http://schemas.openxmlformats.org/schemaLibrary/2006/main" xmlns:a="http://schemas.openxmlformats.org/drawingml/2006/main" xmlns:pic="http://schemas.openxmlformats.org/drawingml/2006/picture" xmlns:c="http://schemas.openxmlformats.org/drawingml/2006/chart" xmlns:lc="http://schemas.openxmlformats.org/drawingml/2006/lockedCanvas" xmlns:dgm="http://schemas.openxmlformats.org/drawingml/2006/diagram" xmlns:wps="http://schemas.microsoft.com/office/word/2010/wordprocessingShape" xmlns:wpg="http://schemas.microsoft.com/office/word/2010/wordprocessingGroup" xmlns:w14="http://schemas.microsoft.com/office/word/2010/wordml" xmlns:w15="http://schemas.microsoft.com/office/word/2012/wordml" xmlns:w16="http://schemas.microsoft.com/office/word/2018/wordml" xmlns:w16cex="http://schemas.microsoft.com/office/word/2018/wordml/cex" xmlns:w16cid="http://schemas.microsoft.com/office/word/2016/wordml/cid" xmlns="http://schemas.microsoft.com/office/tasks/2019/documenttasks" xmlns:cr="http://schemas.microsoft.com/office/comments/2020/reactions">
+  <w:p>
+    <w:pPr>
+      <w:rPr/>
+    </w:pPr>
+    <w:r>
+      <w:rPr>
+        <w:rtl w:val="0"/>
+      </w:rPr>
+    </w:r>
+  </w:p>
+</w:hdr>
+</file>
+
+<file path=word/header2.xml><?xml version="1.0" encoding="utf-8"?>
+<w:hdr xmlns:mc="http://schemas.openxmlformats.org/markup-compatibility/2006" xmlns:o="urn:schemas-microsoft-com:office:office" xmlns:r="http://schemas.openxmlformats.org/officeDocument/2006/relationships" xmlns:m="http://schemas.openxmlformats.org/officeDocument/2006/math" xmlns:v="urn:schemas-microsoft-com:vml" xmlns:wp="http://schemas.openxmlformats.org/drawingml/2006/wordprocessingDrawing" xmlns:w10="urn:schemas-microsoft-com:office:word" xmlns:w="http://schemas.openxmlformats.org/wordprocessingml/2006/main" xmlns:wne="http://schemas.microsoft.com/office/word/2006/wordml" xmlns:sl="http://schemas.openxmlformats.org/schemaLibrary/2006/main" xmlns:a="http://schemas.openxmlformats.org/drawingml/2006/main" xmlns:pic="http://schemas.openxmlformats.org/drawingml/2006/picture" xmlns:c="http://schemas.openxmlformats.org/drawingml/2006/chart" xmlns:lc="http://schemas.openxmlformats.org/drawingml/2006/lockedCanvas" xmlns:dgm="http://schemas.openxmlformats.org/drawingml/2006/diagram" xmlns:wps="http://schemas.microsoft.com/office/word/2010/wordprocessingShape" xmlns:wpg="http://schemas.microsoft.com/office/word/2010/wordprocessingGroup" xmlns:w14="http://schemas.microsoft.com/office/word/2010/wordml" xmlns:w15="http://schemas.microsoft.com/office/word/2012/wordml" xmlns:w16="http://schemas.microsoft.com/office/word/2018/wordml" xmlns:w16cex="http://schemas.microsoft.com/office/word/2018/wordml/cex" xmlns:w16cid="http://schemas.microsoft.com/office/word/2016/wordml/cid" xmlns="http://schemas.microsoft.com/office/tasks/2019/documenttasks" xmlns:cr="http://schemas.microsoft.com/office/comments/2020/reactions">
+  <w:p>
+    <w:pPr>
+      <w:rPr/>
+    </w:pPr>
+    <w:r>
+      <w:rPr>
+        <w:rtl w:val="0"/>
+      </w:rPr>
+    </w:r>
+  </w:p>
+</w:hdr>
 </file>
 
 <file path=word/numbering.xml><?xml version="1.0" encoding="utf-8"?>
@@ -3423,16 +7390,12 @@
     <w:pPr>
       <w:keepNext w:val="1"/>
       <w:keepLines w:val="1"/>
-      <w:pageBreakBefore w:val="0"/>
-      <w:spacing w:after="320" w:before="0" w:lineRule="auto"/>
     </w:pPr>
     <w:rPr>
-      <w:rFonts w:ascii="Arial" w:cs="Arial" w:eastAsia="Arial" w:hAnsi="Arial"/>
-      <w:i w:val="0"/>
-      <w:iCs w:val="0"/>
-      <w:color w:val="666666"/>
-      <w:sz w:val="30"/>
-      <w:szCs w:val="30"/>
+      <w:b w:val="1"/>
+      <w:bCs w:val="1"/>
+      <w:sz w:val="24"/>
+      <w:szCs w:val="24"/>
     </w:rPr>
   </w:style>
   <w:style w:type="table" w:styleId="Table1">
@@ -3450,6 +7413,34 @@
     </w:tblPr>
   </w:style>
   <w:style w:type="table" w:styleId="Table3">
+    <w:basedOn w:val="TableNormal"/>
+    <w:tblPr>
+      <w:tblStyleRowBandSize w:val="1"/>
+      <w:tblStyleColBandSize w:val="1"/>
+    </w:tblPr>
+  </w:style>
+  <w:style w:type="table" w:styleId="Table4">
+    <w:basedOn w:val="TableNormal"/>
+    <w:tblPr>
+      <w:tblStyleRowBandSize w:val="1"/>
+      <w:tblStyleColBandSize w:val="1"/>
+    </w:tblPr>
+  </w:style>
+  <w:style w:type="table" w:styleId="Table5">
+    <w:basedOn w:val="TableNormal"/>
+    <w:tblPr>
+      <w:tblStyleRowBandSize w:val="1"/>
+      <w:tblStyleColBandSize w:val="1"/>
+    </w:tblPr>
+  </w:style>
+  <w:style w:type="table" w:styleId="Table6">
+    <w:basedOn w:val="TableNormal"/>
+    <w:tblPr>
+      <w:tblStyleRowBandSize w:val="1"/>
+      <w:tblStyleColBandSize w:val="1"/>
+    </w:tblPr>
+  </w:style>
+  <w:style w:type="table" w:styleId="Table7">
     <w:basedOn w:val="TableNormal"/>
     <w:tblPr>
       <w:tblStyleRowBandSize w:val="1"/>

</xml_diff>